<commit_message>
Expand Fiango background and revise pilot
</commit_message>
<xml_diff>
--- a/series-development/editable/Grand-Chukuchuku_Editable_Outline.docx
+++ b/series-development/editable/Grand-Chukuchuku_Editable_Outline.docx
@@ -55,7 +55,7 @@
         <w:rPr>
           <w:b w:val="0"/>
         </w:rPr>
-        <w:t>Grand-Chukuchuku follows Zino from street football in Fiango to education in America, deportation in 2019, and a new beginning in Dubai in 2020. His mother's belief sustains him, while financial pressure, temper, people-pleasing, grief, and misplaced trust complicate his ambitions. Success is real, but the house he wants to build for her remains an unfinished promise.</w:t>
+        <w:t>Grand-Chukuchuku follows Zino from a crowded compound in Fiango to education in America, deportation in 2019, and a new beginning in Dubai in 2020. Raised by his mother after his father dies, Zino learns to use humor, intelligence, and stories to face financial pressure, grief, and misplaced trust. Success is real, but the house he wants to build for her remains an unfinished promise.</w:t>
       </w:r>
     </w:p>
     <w:p>
@@ -147,7 +147,7 @@
         <w:rPr>
           <w:b w:val="0"/>
         </w:rPr>
-        <w:t>A gifted boy in Kumba invents an invincible hero while dreaming of building his mother a house. His pursuit of a future takes him to America, through immigration insecurity and an alleged betrayal, and eventually to Dubai, where rebuilding his fortune may be easier than finding peace.</w:t>
+        <w:t>After losing his father, a gifted boy in Kumba invents an invincible hero while dreaming of building his mother a house. His pursuit of a future takes him to America, through immigration insecurity and an alleged betrayal, and eventually to Dubai, where rebuilding his fortune may be easier than finding peace.</w:t>
       </w:r>
     </w:p>
     <w:p>
@@ -163,7 +163,7 @@
         <w:rPr>
           <w:b w:val="0"/>
         </w:rPr>
-        <w:t>In Fiango, Kumba, ten-year-old Zino is clever, competitive, and rarely short of an answer. On the football field, he entertains Luc and Gideo with stories of Grand-Chukuchuku, an imaginary man capable of impossible feats. Around the shared well and the compound's central mango tree, his world is full of humor, affection, and neighborhood life. His mother, a teacher raising him alone, believes in him. Zino's deepest fear is that he will never build her a house.</w:t>
+        <w:t>In Fiango, Kumba, ten-year-old Zino is clever, competitive, and rarely short of an answer. On the football field, he entertains Luc and Gideon, known as Gideo, with stories of Grand-Chukuchuku, an imaginary man capable of impossible feats. His compound's well, mango tree, crowded tenants, and the landlord's monthly rent and electricity collection make money impossible to ignore. Zino's deepest fear is that he will never build his mother a house.</w:t>
       </w:r>
     </w:p>
     <w:p>
@@ -171,7 +171,7 @@
         <w:rPr>
           <w:b w:val="0"/>
         </w:rPr>
-        <w:t>His intelligence cannot protect him from unpaid school fees. Exclusions during primary and high school become recurring reminders that opportunity depends on money as well as ability. A paternal uncle helps from time to time. Boarding school, fence-jumping trips home for food, friendships, first love, and an inspiring chemistry teacher give these years warmth and texture. Zino completes secondary school in 2007 and his first degree in 2011. America becomes a practical possibility, funded by his uncle, friends and family, and the sale of a large piece of family land.</w:t>
+        <w:t>Zino is raised by his mother, a primary-school teacher. His father dies after a snake bite while spraying cocoa; in the family account, he passes out before reaching home. His age at the loss remains to be placed. School-fee exclusions, boarding-school trips over the fence to eat at home, friendship, first love, and Miss Mukete's influence make education both hope and pressure. Professional School provides June evenings for study, social life, and escape. Zino completes secondary school in 2007 and his first degree in 2011. His uncle, friends, family, and a land sale make America possible.</w:t>
       </w:r>
     </w:p>
     <w:p>
@@ -195,15 +195,7 @@
         <w:rPr>
           <w:b w:val="0"/>
         </w:rPr>
-        <w:t>He spends roughly six months in Cameroon before moving to Dubai in 2020 to work for a Chinese online retailer of digital products. COVID complicates the new beginning. Across the wider story, the Ambazonian crisis brings family bereavement, housing loss, disrupted farming, and relatives crowded into a two-bedroom home in Douala. His supportive maternal aunt is killed. These events must be placed at their actual dates, rather than assumed to follow his deportation.</w:t>
-      </w:r>
-    </w:p>
-    <w:p>
-      <w:r>
-        <w:rPr>
-          <w:b w:val="0"/>
-        </w:rPr>
-        <w:t>Zino eventually becomes a successful crypto merchant in Dubai. The final chapter asks what this success can repair, what grief it cannot remove, and whether he can find happiness without becoming the invincible character he invented. The proposed emotional destination is redemption grounded in truthful choices and relationships. His mother's house remains unbuilt: an honest, open promise that carries hope beyond the ending.</w:t>
+        <w:t>He spends roughly six months in Cameroon before moving to Dubai in 2020 to work for a Chinese online retailer of digital products. COVID complicates the new beginning. The Ambazonian crisis brings family bereavement, housing loss, disrupted farming, and relatives crowded into a two-bedroom home in Douala; his supportive maternal aunt is killed. Zino eventually becomes a successful crypto merchant in Dubai. The final chapter asks whether this success can bring peace without turning his mother's unbuilt house into a false ending.</w:t>
       </w:r>
     </w:p>
     <w:p>
@@ -243,13 +235,13 @@
         <w:rPr>
           <w:b/>
         </w:rPr>
-        <w:t>His mother:</w:t>
+        <w:t>His father:</w:t>
       </w:r>
       <w:r>
         <w:rPr>
           <w:b w:val="0"/>
         </w:rPr>
-        <w:t xml:space="preserve"> A teacher who raises him as a single mother and believes in his future. Develop her own work, humor, ambitions, and burdens as well as her sacrifices for Zino. Her name and individual memories remain to be supplied.</w:t>
+        <w:t xml:space="preserve"> Dies from a snake bite while spraying cocoa. In the family account, he cuts the bite area and tries to suck out the venom, then passes out before reaching home; his right arm is swollen. This is a family-history account, not medical guidance. Confirm the date, Zino's age, and the immediate effect on the household before scripting the scene.</w:t>
       </w:r>
     </w:p>
     <w:p>
@@ -262,13 +254,13 @@
         <w:rPr>
           <w:b/>
         </w:rPr>
-        <w:t>Paternal uncle:</w:t>
+        <w:t>His mother:</w:t>
       </w:r>
       <w:r>
         <w:rPr>
           <w:b w:val="0"/>
         </w:rPr>
-        <w:t xml:space="preserve"> Provides occasional school-fee support and helps make America possible. His precise contributions and relationship with Zino need expansion; no financial conditions or motives have been established.</w:t>
+        <w:t xml:space="preserve"> A primary-school teacher from a young age and throughout Zino's childhood. After his father's death, she raises Zino and believes in his future. Develop her own work, humor, ambitions, and burdens as well as her sacrifices. Her name and individual memories remain to be supplied.</w:t>
       </w:r>
     </w:p>
     <w:p>
@@ -281,13 +273,51 @@
         <w:rPr>
           <w:b/>
         </w:rPr>
-        <w:t>Luc and Gideo:</w:t>
+        <w:t>Paternal uncle:</w:t>
       </w:r>
       <w:r>
         <w:rPr>
           <w:b w:val="0"/>
         </w:rPr>
-        <w:t xml:space="preserve"> Zino's closest childhood friends and an audience for his Grand-Chukuchuku stories. Their separate personalities and adult paths need development. They have not been identified as the friends involved in the later allegation.</w:t>
+        <w:t xml:space="preserve"> Provides occasional school-fee support and helps make America possible. His precise contributions and relationship with Zino need expansion; no financial conditions or motives have been established.</w:t>
+      </w:r>
+    </w:p>
+    <w:p>
+      <w:r>
+        <w:rPr>
+          <w:b w:val="0"/>
+        </w:rPr>
+      </w:r>
+      <w:r>
+        <w:rPr>
+          <w:b/>
+        </w:rPr>
+        <w:t>Gideon (Gideo):</w:t>
+      </w:r>
+      <w:r>
+        <w:rPr>
+          <w:b w:val="0"/>
+        </w:rPr>
+        <w:t xml:space="preserve"> Sharp, business-minded, and always looking for a way to make money. He buys his first camera in secondary school and often pays when he and Zino go out. He values Zino's company because Zino can talk to girls, while Gideon's quietness leaves girls feeling bored. Confirm whether Gideo is his nickname before scripts use it consistently.</w:t>
+      </w:r>
+    </w:p>
+    <w:p>
+      <w:r>
+        <w:rPr>
+          <w:b w:val="0"/>
+        </w:rPr>
+      </w:r>
+      <w:r>
+        <w:rPr>
+          <w:b/>
+        </w:rPr>
+        <w:t>Luc:</w:t>
+      </w:r>
+      <w:r>
+        <w:rPr>
+          <w:b w:val="0"/>
+        </w:rPr>
+        <w:t xml:space="preserve"> God-fearing, funny, candid, and often carrying a small Gideons Bible. He approaches students to preach. He values Zino's directness, help with maths, and ability to talk openly about girls. Confirm the preferred Bible wording and his age in these memories.</w:t>
       </w:r>
     </w:p>
     <w:p>
@@ -390,7 +420,7 @@
         <w:pStyle w:val="Heading2"/>
       </w:pPr>
       <w:r>
-        <w:t>Chronology</w:t>
+        <w:t>Fiango world</w:t>
       </w:r>
     </w:p>
     <w:p>
@@ -398,19 +428,18 @@
         <w:rPr>
           <w:b w:val="0"/>
         </w:rPr>
-        <w:t xml:space="preserve">- </w:t>
       </w:r>
       <w:r>
         <w:rPr>
           <w:b/>
         </w:rPr>
-        <w:t>1990:</w:t>
+        <w:t>The Fiango compound:</w:t>
       </w:r>
       <w:r>
         <w:rPr>
           <w:b w:val="0"/>
         </w:rPr>
-        <w:t xml:space="preserve"> Zino is born.</w:t>
+        <w:t xml:space="preserve"> Two families, three single mothers, two bachelors, and three students rent within the compound. The shared well, mango tree, monthly rent, and electricity collection make it a living social system, not just a backdrop.</w:t>
       </w:r>
     </w:p>
     <w:p>
@@ -418,19 +447,18 @@
         <w:rPr>
           <w:b w:val="0"/>
         </w:rPr>
-        <w:t xml:space="preserve">- </w:t>
       </w:r>
       <w:r>
         <w:rPr>
           <w:b/>
         </w:rPr>
-        <w:t>1999:</w:t>
+        <w:t>Professional School:</w:t>
       </w:r>
       <w:r>
         <w:rPr>
           <w:b w:val="0"/>
         </w:rPr>
-        <w:t xml:space="preserve"> Primary school completed; its fee exclusion belongs before this milestone.</w:t>
+        <w:t xml:space="preserve"> Around June, students gather at school in the evenings to prepare for an examination. Some read alone or in groups; others use the gathering to socialize, smoke, drink, court girls, or simply escape home. Treat the setting as varied: it is not true that every student misbehaves. Confirm whether the examination is the GCE or the Government Common Entrance.</w:t>
       </w:r>
     </w:p>
     <w:p>
@@ -438,19 +466,18 @@
         <w:rPr>
           <w:b w:val="0"/>
         </w:rPr>
-        <w:t xml:space="preserve">- </w:t>
       </w:r>
       <w:r>
         <w:rPr>
           <w:b/>
         </w:rPr>
-        <w:t>Around 2000:</w:t>
+        <w:t>Jungle justice:</w:t>
       </w:r>
       <w:r>
         <w:rPr>
           <w:b w:val="0"/>
         </w:rPr>
-        <w:t xml:space="preserve"> Opening: Zino is ten, in Fiango, after primary school.</w:t>
+        <w:t xml:space="preserve"> Zino reports witnessing at least four incidents in Fiango in which people accused of theft were attacked by a crowd and burned with tires and fuel. This belongs in the story as traumatic exposure and a source of fear, silence, or moral conflict. Do not stage the violence as spectacle; establish each incident's date, Zino's age, and what he witnessed directly before dramatizing it.</w:t>
       </w:r>
     </w:p>
     <w:p>
@@ -458,39 +485,26 @@
         <w:rPr>
           <w:b w:val="0"/>
         </w:rPr>
-        <w:t xml:space="preserve">- </w:t>
       </w:r>
       <w:r>
         <w:rPr>
           <w:b/>
         </w:rPr>
-        <w:t>2007:</w:t>
+        <w:t>Everyday texture:</w:t>
       </w:r>
       <w:r>
         <w:rPr>
           <w:b w:val="0"/>
         </w:rPr>
-        <w:t xml:space="preserve"> Secondary school completed; high-school fee exclusion has no exact date yet.</w:t>
+        <w:t xml:space="preserve"> Food, church, football, music, school routines, discipline, slang, celebrations, neighborhood life, and the sound of the landlord's monthly visit can keep the world specific and alive.</w:t>
       </w:r>
     </w:p>
     <w:p>
-      <w:r>
-        <w:rPr>
-          <w:b w:val="0"/>
-        </w:rPr>
-        <w:t xml:space="preserve">- </w:t>
-      </w:r>
-      <w:r>
-        <w:rPr>
-          <w:b/>
-        </w:rPr>
-        <w:t>2011:</w:t>
-      </w:r>
-      <w:r>
-        <w:rPr>
-          <w:b w:val="0"/>
-        </w:rPr>
-        <w:t xml:space="preserve"> First degree completed; subject and institution need confirmation.</w:t>
+      <w:pPr>
+        <w:pStyle w:val="Heading2"/>
+      </w:pPr>
+      <w:r>
+        <w:t>Chronology</w:t>
       </w:r>
     </w:p>
     <w:p>
@@ -504,13 +518,13 @@
         <w:rPr>
           <w:b/>
         </w:rPr>
-        <w:t>2012:</w:t>
+        <w:t>1990:</w:t>
       </w:r>
       <w:r>
         <w:rPr>
           <w:b w:val="0"/>
         </w:rPr>
-        <w:t xml:space="preserve"> Moves to the United States; Oklahoma and East Central University are identified.</w:t>
+        <w:t xml:space="preserve"> Zino is born.</w:t>
       </w:r>
     </w:p>
     <w:p>
@@ -524,13 +538,13 @@
         <w:rPr>
           <w:b/>
         </w:rPr>
-        <w:t>2014:</w:t>
+        <w:t>1999:</w:t>
       </w:r>
       <w:r>
         <w:rPr>
           <w:b w:val="0"/>
         </w:rPr>
-        <w:t xml:space="preserve"> Master's completed; social-work studies identified; exact award title to confirm.</w:t>
+        <w:t xml:space="preserve"> Primary school completed; its fee exclusion belongs before this milestone.</w:t>
       </w:r>
     </w:p>
     <w:p>
@@ -544,13 +558,13 @@
         <w:rPr>
           <w:b/>
         </w:rPr>
-        <w:t>Before 2019:</w:t>
+        <w:t>Around 2000:</w:t>
       </w:r>
       <w:r>
         <w:rPr>
           <w:b w:val="0"/>
         </w:rPr>
-        <w:t xml:space="preserve"> Nine-month course, three hackathon wins, Nkap, then njangi.xyz. Exact years open.</w:t>
+        <w:t xml:space="preserve"> Opening: Zino is ten, in Fiango, after primary school.</w:t>
       </w:r>
     </w:p>
     <w:p>
@@ -564,13 +578,13 @@
         <w:rPr>
           <w:b/>
         </w:rPr>
-        <w:t>2019:</w:t>
+        <w:t>2007:</w:t>
       </w:r>
       <w:r>
         <w:rPr>
           <w:b w:val="0"/>
         </w:rPr>
-        <w:t xml:space="preserve"> Deportation for remaining without appropriate immigration documents.</w:t>
+        <w:t xml:space="preserve"> Secondary school completed; high-school fee exclusion has no exact date yet.</w:t>
       </w:r>
     </w:p>
     <w:p>
@@ -584,13 +598,13 @@
         <w:rPr>
           <w:b/>
         </w:rPr>
-        <w:t>2019-2020:</w:t>
+        <w:t>2011:</w:t>
       </w:r>
       <w:r>
         <w:rPr>
           <w:b w:val="0"/>
         </w:rPr>
-        <w:t xml:space="preserve"> Roughly six months in Cameroon before the Dubai move; exact months open.</w:t>
+        <w:t xml:space="preserve"> First degree completed; subject and institution need confirmation.</w:t>
       </w:r>
     </w:p>
     <w:p>
@@ -604,13 +618,13 @@
         <w:rPr>
           <w:b/>
         </w:rPr>
-        <w:t>2020 onward:</w:t>
+        <w:t>2012:</w:t>
       </w:r>
       <w:r>
         <w:rPr>
           <w:b w:val="0"/>
         </w:rPr>
-        <w:t xml:space="preserve"> Dubai, digital-retail employment, COVID, and later crypto-merchant success.</w:t>
+        <w:t xml:space="preserve"> Moves to the United States; Oklahoma and East Central University are identified.</w:t>
       </w:r>
     </w:p>
     <w:p>
@@ -624,13 +638,153 @@
         <w:rPr>
           <w:b/>
         </w:rPr>
+        <w:t>2014:</w:t>
+      </w:r>
+      <w:r>
+        <w:rPr>
+          <w:b w:val="0"/>
+        </w:rPr>
+        <w:t xml:space="preserve"> Master's completed; social-work studies identified; exact award title to confirm.</w:t>
+      </w:r>
+    </w:p>
+    <w:p>
+      <w:r>
+        <w:rPr>
+          <w:b w:val="0"/>
+        </w:rPr>
+        <w:t xml:space="preserve">- </w:t>
+      </w:r>
+      <w:r>
+        <w:rPr>
+          <w:b/>
+        </w:rPr>
+        <w:t>Before 2019:</w:t>
+      </w:r>
+      <w:r>
+        <w:rPr>
+          <w:b w:val="0"/>
+        </w:rPr>
+        <w:t xml:space="preserve"> Nine-month course, three hackathon wins, Nkap, then njangi.xyz. Exact years open.</w:t>
+      </w:r>
+    </w:p>
+    <w:p>
+      <w:r>
+        <w:rPr>
+          <w:b w:val="0"/>
+        </w:rPr>
+        <w:t xml:space="preserve">- </w:t>
+      </w:r>
+      <w:r>
+        <w:rPr>
+          <w:b/>
+        </w:rPr>
+        <w:t>2019:</w:t>
+      </w:r>
+      <w:r>
+        <w:rPr>
+          <w:b w:val="0"/>
+        </w:rPr>
+        <w:t xml:space="preserve"> Deportation for remaining without appropriate immigration documents.</w:t>
+      </w:r>
+    </w:p>
+    <w:p>
+      <w:r>
+        <w:rPr>
+          <w:b w:val="0"/>
+        </w:rPr>
+        <w:t xml:space="preserve">- </w:t>
+      </w:r>
+      <w:r>
+        <w:rPr>
+          <w:b/>
+        </w:rPr>
+        <w:t>2019-2020:</w:t>
+      </w:r>
+      <w:r>
+        <w:rPr>
+          <w:b w:val="0"/>
+        </w:rPr>
+        <w:t xml:space="preserve"> Roughly six months in Cameroon before the Dubai move; exact months open.</w:t>
+      </w:r>
+    </w:p>
+    <w:p>
+      <w:r>
+        <w:rPr>
+          <w:b w:val="0"/>
+        </w:rPr>
+        <w:t xml:space="preserve">- </w:t>
+      </w:r>
+      <w:r>
+        <w:rPr>
+          <w:b/>
+        </w:rPr>
+        <w:t>2020 onward:</w:t>
+      </w:r>
+      <w:r>
+        <w:rPr>
+          <w:b w:val="0"/>
+        </w:rPr>
+        <w:t xml:space="preserve"> Dubai, digital-retail employment, COVID, and later crypto-merchant success.</w:t>
+      </w:r>
+    </w:p>
+    <w:p>
+      <w:r>
+        <w:rPr>
+          <w:b w:val="0"/>
+        </w:rPr>
+        <w:t xml:space="preserve">- </w:t>
+      </w:r>
+      <w:r>
+        <w:rPr>
+          <w:b/>
+        </w:rPr>
+        <w:t>Date to place:</w:t>
+      </w:r>
+      <w:r>
+        <w:rPr>
+          <w:b w:val="0"/>
+        </w:rPr>
+        <w:t xml:space="preserve"> Father's death after a snake bite while spraying cocoa; confirm Zino's age and the family aftermath.</w:t>
+      </w:r>
+    </w:p>
+    <w:p>
+      <w:r>
+        <w:rPr>
+          <w:b w:val="0"/>
+        </w:rPr>
+        <w:t xml:space="preserve">- </w:t>
+      </w:r>
+      <w:r>
+        <w:rPr>
+          <w:b/>
+        </w:rPr>
         <w:t>Dates to place:</w:t>
       </w:r>
       <w:r>
         <w:rPr>
           <w:b w:val="0"/>
         </w:rPr>
-        <w:t xml:space="preserve"> Aunt's killing, loss of housing and farming income, relocation to Douala.</w:t>
+        <w:t xml:space="preserve"> Aunt's killing, loss of housing and farming income, relocation to Douala, and each reported jungle-justice incident.</w:t>
+      </w:r>
+    </w:p>
+    <w:p>
+      <w:r>
+        <w:rPr>
+          <w:b w:val="0"/>
+        </w:rPr>
+        <w:t xml:space="preserve">- </w:t>
+      </w:r>
+      <w:r>
+        <w:rPr>
+          <w:b/>
+        </w:rPr>
+        <w:t>June study sessions:</w:t>
+      </w:r>
+      <w:r>
+        <w:rPr>
+          <w:b w:val="0"/>
+        </w:rPr>
+        <w:t xml:space="preserve"> Professional School appears during secondary-school years; confirm the school, years, and whether the examination was the GCE or Government Common Entrance.</w:t>
       </w:r>
     </w:p>
     <w:p>
@@ -774,7 +928,7 @@
         <w:rPr>
           <w:b w:val="0"/>
         </w:rPr>
-        <w:t>Street football introduces Zino's wit, competitiveness, and temper. Luc and Gideo hear his outrageous stories about Grand-Chukuchuku, the man who achieves what nobody else can. Brief fantasy sequences make those boasts visible before returning us to the real game. The neighboring houses, shared well, and central mango tree establish the compound as the emotional center of his world. At home, his mother's belief gives his confidence a foundation. Beneath the jokes lies a lasting desire: to build her a house.</w:t>
+        <w:t>Street football introduces Zino's wit, competitiveness, and temper. Luc and Gideon, known as Gideo, hear his outrageous stories about Grand-Chukuchuku, the man who achieves what nobody else can. Brief fantasy sequences make those boasts visible before returning us to the real game. The compound is a small society: two families, three single mothers, two bachelors, and three student tenants share the well and mango tree. The landlord's monthly collection of rent and electricity money turns money into a recurring presence. Zino's mother, a primary-school teacher, believes in him. His father's death after a snake bite while spraying cocoa belongs as a memory once its date and Zino's age are confirmed.</w:t>
       </w:r>
     </w:p>
     <w:p>
@@ -793,7 +947,7 @@
         <w:rPr>
           <w:b w:val="0"/>
         </w:rPr>
-        <w:t xml:space="preserve"> His imagination can win an argument, but the family's financial limits cannot be wished away.</w:t>
+        <w:t xml:space="preserve"> His imagination can win an argument, but the household's limits cannot be wished away.</w:t>
       </w:r>
     </w:p>
     <w:p>
@@ -809,7 +963,7 @@
         <w:rPr>
           <w:b w:val="0"/>
         </w:rPr>
-        <w:t>Education reveals both Zino's ability and the limits of that advantage. His earlier primary-school fee exclusion can return as a clearly placed memory; the later high-school exclusion belongs at its actual date. His mother's teaching income and his uncle's intermittent help keep opportunity alive without removing uncertainty. Boarding school in Kumba supplies comic escapes over the fence to eat at home. Friendships, first love, and Miss Mukete's influence enter at their confirmed ages. His wish to impress people begins to compete with his need to be honest about what he cannot control.</w:t>
+        <w:t>Education reveals both Zino's ability and the limits of that advantage. His earlier primary-school fee exclusion can return as a clearly placed memory; the later high-school exclusion belongs at its actual date. His mother's primary-school teaching income and his uncle's intermittent help keep opportunity alive without removing uncertainty. Boarding school in Kumba supplies comic escapes over the fence to eat at home. Each June, Professional School gives students evening time to revise, study in groups, socialize, or escape home; show its temptations without claiming every student is distracted. Zino also reports witnessing jungle justice in Fiango. Treat this as traumatic background, carried through fear and aftermath rather than graphic spectacle.</w:t>
       </w:r>
     </w:p>
     <w:p>
@@ -905,13 +1059,13 @@
         <w:rPr>
           <w:b/>
         </w:rPr>
-        <w:t>The Fence:</w:t>
+        <w:t>School Fees:</w:t>
       </w:r>
       <w:r>
         <w:rPr>
           <w:b w:val="0"/>
         </w:rPr>
-        <w:t xml:space="preserve"> A boarding-school escape for a meal at home reveals ingenuity, appetite, and the pull of belonging.</w:t>
+        <w:t xml:space="preserve"> At the remembered age, a fee exclusion interrupts academic confidence and changes the rhythm of an ordinary school day.</w:t>
       </w:r>
     </w:p>
     <w:p>
@@ -925,13 +1079,33 @@
         <w:rPr>
           <w:b/>
         </w:rPr>
-        <w:t>School Fees:</w:t>
+        <w:t>Professional School:</w:t>
       </w:r>
       <w:r>
         <w:rPr>
           <w:b w:val="0"/>
         </w:rPr>
-        <w:t xml:space="preserve"> At the remembered age, a fee exclusion interrupts academic confidence and changes the rhythm of an ordinary school day.</w:t>
+        <w:t xml:space="preserve"> June evening revision creates a divided space: some students study; some pursue distraction; Zino must decide what kind of future he is preparing for.</w:t>
+      </w:r>
+    </w:p>
+    <w:p>
+      <w:r>
+        <w:rPr>
+          <w:b w:val="0"/>
+        </w:rPr>
+        <w:t xml:space="preserve">4. </w:t>
+      </w:r>
+      <w:r>
+        <w:rPr>
+          <w:b/>
+        </w:rPr>
+        <w:t>The Crowd:</w:t>
+      </w:r>
+      <w:r>
+        <w:rPr>
+          <w:b w:val="0"/>
+        </w:rPr>
+        <w:t xml:space="preserve"> After Zino witnesses the aftermath of an alleged thief being attacked, the episode stays with his fear, the adults' silence, and the question of justice rather than depicting the killing.</w:t>
       </w:r>
     </w:p>
     <w:p>
@@ -947,7 +1121,7 @@
         <w:rPr>
           <w:b w:val="0"/>
         </w:rPr>
-        <w:t>1. Which secondary school did you enter, when did boarding begin, and what did the uniform look like?</w:t>
+        <w:t>1. Which secondary school did you enter, when did boarding begin, and what is one defining memory of Luc, Gideon (Gideo), Elianne, or Miss Mukete?</w:t>
       </w:r>
     </w:p>
     <w:p>
@@ -973,7 +1147,7 @@
         <w:rPr>
           <w:b w:val="0"/>
         </w:rPr>
-        <w:t>2. Describe a fee-exclusion day: who spoke, how you returned home, and what happened next.</w:t>
+        <w:t>2. How old were you when your father died, and what do you remember directly versus what relatives told you?</w:t>
       </w:r>
     </w:p>
     <w:p>
@@ -999,7 +1173,7 @@
         <w:rPr>
           <w:b w:val="0"/>
         </w:rPr>
-        <w:t>3. Reconstruct one fence-jumping trip: companions, route, food, and any consequences.</w:t>
+        <w:t>3. What did Professional School mean in your school, which exam was it for, and what is one evening you remember?</w:t>
       </w:r>
     </w:p>
     <w:p>
@@ -1025,7 +1199,7 @@
         <w:rPr>
           <w:b w:val="0"/>
         </w:rPr>
-        <w:t>4. When did Luc, Gideo, Elianne, and Miss Mukete enter your life? Give one defining memory of each.</w:t>
+        <w:t>4. For each jungle-justice incident, what did you witness directly, how old were you, and what effect did it have on you?</w:t>
       </w:r>
     </w:p>
     <w:p>
@@ -1081,7 +1255,7 @@
         <w:rPr>
           <w:b w:val="0"/>
         </w:rPr>
-        <w:t xml:space="preserve"> The opening is at ten, after primary completion in 1999. The previously drafted age-ten fee scene is a proposed composite, not a confirmed dated memory.</w:t>
+        <w:t xml:space="preserve"> The opening is at ten, after primary completion in 1999. The age-ten fee scene remains a proposed composite. Confirm Zino's age at his father's death; confirm whether Gideo is Gideon's nickname; and distinguish GCE from Government Common Entrance before using Professional School in a dated scene.</w:t>
       </w:r>
     </w:p>
     <w:p>

</xml_diff>

<commit_message>
Clarify Fiango history and add crowd episode
</commit_message>
<xml_diff>
--- a/series-development/editable/Grand-Chukuchuku_Editable_Outline.docx
+++ b/series-development/editable/Grand-Chukuchuku_Editable_Outline.docx
@@ -163,7 +163,7 @@
         <w:rPr>
           <w:b w:val="0"/>
         </w:rPr>
-        <w:t>In Fiango, Kumba, ten-year-old Zino is clever, competitive, and rarely short of an answer. On the football field, he entertains Luc and Gideon, known as Gideo, with stories of Grand-Chukuchuku, an imaginary man capable of impossible feats. His compound's well, mango tree, crowded tenants, and the landlord's monthly rent and electricity collection make money impossible to ignore. Zino's deepest fear is that he will never build his mother a house.</w:t>
+        <w:t>In Fiango, Kumba, ten-year-old Zino is clever, competitive, and rarely short of an answer. On the football field, he entertains Luc and Gideon with stories of Grand-Chukuchuku, an imaginary man capable of impossible feats. His compound's well, mango tree, crowded tenants, and the landlord's monthly rent and electricity collection make money impossible to ignore. Zino's deepest fear is that he will never build his mother a house.</w:t>
       </w:r>
     </w:p>
     <w:p>
@@ -171,7 +171,7 @@
         <w:rPr>
           <w:b w:val="0"/>
         </w:rPr>
-        <w:t>Zino is raised by his mother, a primary-school teacher. His father dies after a snake bite while spraying cocoa; in the family account, he passes out before reaching home. His age at the loss remains to be placed. School-fee exclusions, boarding-school trips over the fence to eat at home, friendship, first love, and Miss Mukete's influence make education both hope and pressure. Professional School provides June evenings for study, social life, and escape. Zino completes secondary school in 2007 and his first degree in 2011. His uncle, friends, family, and a land sale make America possible.</w:t>
+        <w:t>Zino is raised by his mother, a primary-school teacher. His father dies after a snake bite while spraying cocoa when Zino is two; in the family account, he passes out before reaching home. Zino has no direct memory of the loss. School-fee exclusions, boarding-school trips over the fence to eat at home, friendship, first love, and Miss Mukete's influence make education both hope and pressure. Professional School, a daytime vocational campus, opens its classrooms at night for secondary-school students to revise, socialize, and escape home. Zino completes secondary school in 2007 and his first degree in 2011. His uncle, friends, family, and a land sale make America possible.</w:t>
       </w:r>
     </w:p>
     <w:p>
@@ -241,7 +241,7 @@
         <w:rPr>
           <w:b w:val="0"/>
         </w:rPr>
-        <w:t xml:space="preserve"> Dies from a snake bite while spraying cocoa. In the family account, he cuts the bite area and tries to suck out the venom, then passes out before reaching home; his right arm is swollen. This is a family-history account, not medical guidance. Confirm the date, Zino's age, and the immediate effect on the household before scripting the scene.</w:t>
+        <w:t xml:space="preserve"> Dies from a snake bite while spraying cocoa when Zino is two. In the family account, he cuts the bite area and tries to suck out the venom, then passes out before reaching home; his right arm is swollen. Zino has no personal recollection, so this belongs in family testimony or a prologue rather than a firsthand flashback. This is family history, not medical guidance.</w:t>
       </w:r>
     </w:p>
     <w:p>
@@ -292,13 +292,13 @@
         <w:rPr>
           <w:b/>
         </w:rPr>
-        <w:t>Gideon (Gideo):</w:t>
+        <w:t>Gideon:</w:t>
       </w:r>
       <w:r>
         <w:rPr>
           <w:b w:val="0"/>
         </w:rPr>
-        <w:t xml:space="preserve"> Sharp, business-minded, and always looking for a way to make money. He buys his first camera in secondary school and often pays when he and Zino go out. He values Zino's company because Zino can talk to girls, while Gideon's quietness leaves girls feeling bored. Confirm whether Gideo is his nickname before scripts use it consistently.</w:t>
+        <w:t xml:space="preserve"> Sharp, business-minded, and always looking for a way to make money. He buys his first camera in secondary school and often pays when he and Zino go out. He values Zino's company because Zino can talk to girls, while Gideon's quietness leaves girls feeling bored.</w:t>
       </w:r>
     </w:p>
     <w:p>
@@ -458,7 +458,7 @@
         <w:rPr>
           <w:b w:val="0"/>
         </w:rPr>
-        <w:t xml:space="preserve"> Around June, students gather at school in the evenings to prepare for an examination. Some read alone or in groups; others use the gathering to socialize, smoke, drink, court girls, or simply escape home. Treat the setting as varied: it is not true that every student misbehaves. Confirm whether the examination is the GCE or the Government Common Entrance.</w:t>
+        <w:t xml:space="preserve"> A real vocational school active in daytime for building, construction, and electrical training. During the secondary-school years, its classrooms open at night around June for students to revise for the exam period. Some read alone or in groups; others use the gathering to socialize, smoke, drink, court girls, or simply escape home. Treat the setting as varied: it is not true that every student misbehaves.</w:t>
       </w:r>
     </w:p>
     <w:p>
@@ -477,7 +477,7 @@
         <w:rPr>
           <w:b w:val="0"/>
         </w:rPr>
-        <w:t xml:space="preserve"> Zino reports witnessing at least four incidents in Fiango in which people accused of theft were attacked by a crowd and burned with tires and fuel. This belongs in the story as traumatic exposure and a source of fear, silence, or moral conflict. Do not stage the violence as spectacle; establish each incident's date, Zino's age, and what he witnessed directly before dramatizing it.</w:t>
+        <w:t xml:space="preserve"> During his secondary-school years, Zino reports witnessing at least four incidents in Fiango in which people accused of theft were attacked by a crowd and burned with tires and fuel. This belongs in the story as traumatic exposure and a source of fear, silence, or moral conflict. Do not stage the violence as spectacle; use a composite episode that stays with consequence, sound, and moral uncertainty.</w:t>
       </w:r>
     </w:p>
     <w:p>
@@ -538,13 +538,13 @@
         <w:rPr>
           <w:b/>
         </w:rPr>
-        <w:t>1999:</w:t>
+        <w:t>Around 1992:</w:t>
       </w:r>
       <w:r>
         <w:rPr>
           <w:b w:val="0"/>
         </w:rPr>
-        <w:t xml:space="preserve"> Primary school completed; its fee exclusion belongs before this milestone.</w:t>
+        <w:t xml:space="preserve"> Zino's father dies after a snake bite while spraying cocoa, when Zino is two. Zino has no direct recollection.</w:t>
       </w:r>
     </w:p>
     <w:p>
@@ -558,13 +558,13 @@
         <w:rPr>
           <w:b/>
         </w:rPr>
-        <w:t>Around 2000:</w:t>
+        <w:t>1999:</w:t>
       </w:r>
       <w:r>
         <w:rPr>
           <w:b w:val="0"/>
         </w:rPr>
-        <w:t xml:space="preserve"> Opening: Zino is ten, in Fiango, after primary school.</w:t>
+        <w:t xml:space="preserve"> Primary school completed; its fee exclusion belongs before this milestone.</w:t>
       </w:r>
     </w:p>
     <w:p>
@@ -578,13 +578,13 @@
         <w:rPr>
           <w:b/>
         </w:rPr>
-        <w:t>2007:</w:t>
+        <w:t>Around 2000:</w:t>
       </w:r>
       <w:r>
         <w:rPr>
           <w:b w:val="0"/>
         </w:rPr>
-        <w:t xml:space="preserve"> Secondary school completed; high-school fee exclusion has no exact date yet.</w:t>
+        <w:t xml:space="preserve"> Opening: Zino is ten, in Fiango, after primary school.</w:t>
       </w:r>
     </w:p>
     <w:p>
@@ -598,13 +598,13 @@
         <w:rPr>
           <w:b/>
         </w:rPr>
-        <w:t>2011:</w:t>
+        <w:t>2007:</w:t>
       </w:r>
       <w:r>
         <w:rPr>
           <w:b w:val="0"/>
         </w:rPr>
-        <w:t xml:space="preserve"> First degree completed; subject and institution need confirmation.</w:t>
+        <w:t xml:space="preserve"> Secondary school completed; high-school fee exclusion has no exact date yet.</w:t>
       </w:r>
     </w:p>
     <w:p>
@@ -618,13 +618,13 @@
         <w:rPr>
           <w:b/>
         </w:rPr>
-        <w:t>2012:</w:t>
+        <w:t>2011:</w:t>
       </w:r>
       <w:r>
         <w:rPr>
           <w:b w:val="0"/>
         </w:rPr>
-        <w:t xml:space="preserve"> Moves to the United States; Oklahoma and East Central University are identified.</w:t>
+        <w:t xml:space="preserve"> First degree completed; subject and institution need confirmation.</w:t>
       </w:r>
     </w:p>
     <w:p>
@@ -638,13 +638,13 @@
         <w:rPr>
           <w:b/>
         </w:rPr>
-        <w:t>2014:</w:t>
+        <w:t>2012:</w:t>
       </w:r>
       <w:r>
         <w:rPr>
           <w:b w:val="0"/>
         </w:rPr>
-        <w:t xml:space="preserve"> Master's completed; social-work studies identified; exact award title to confirm.</w:t>
+        <w:t xml:space="preserve"> Moves to the United States; Oklahoma and East Central University are identified.</w:t>
       </w:r>
     </w:p>
     <w:p>
@@ -658,13 +658,13 @@
         <w:rPr>
           <w:b/>
         </w:rPr>
-        <w:t>Before 2019:</w:t>
+        <w:t>2014:</w:t>
       </w:r>
       <w:r>
         <w:rPr>
           <w:b w:val="0"/>
         </w:rPr>
-        <w:t xml:space="preserve"> Nine-month course, three hackathon wins, Nkap, then njangi.xyz. Exact years open.</w:t>
+        <w:t xml:space="preserve"> Master's completed; social-work studies identified; exact award title to confirm.</w:t>
       </w:r>
     </w:p>
     <w:p>
@@ -678,13 +678,13 @@
         <w:rPr>
           <w:b/>
         </w:rPr>
-        <w:t>2019:</w:t>
+        <w:t>Before 2019:</w:t>
       </w:r>
       <w:r>
         <w:rPr>
           <w:b w:val="0"/>
         </w:rPr>
-        <w:t xml:space="preserve"> Deportation for remaining without appropriate immigration documents.</w:t>
+        <w:t xml:space="preserve"> Nine-month course, three hackathon wins, Nkap, then njangi.xyz. Exact years open.</w:t>
       </w:r>
     </w:p>
     <w:p>
@@ -698,13 +698,13 @@
         <w:rPr>
           <w:b/>
         </w:rPr>
-        <w:t>2019-2020:</w:t>
+        <w:t>2019:</w:t>
       </w:r>
       <w:r>
         <w:rPr>
           <w:b w:val="0"/>
         </w:rPr>
-        <w:t xml:space="preserve"> Roughly six months in Cameroon before the Dubai move; exact months open.</w:t>
+        <w:t xml:space="preserve"> Deportation for remaining without appropriate immigration documents.</w:t>
       </w:r>
     </w:p>
     <w:p>
@@ -718,13 +718,13 @@
         <w:rPr>
           <w:b/>
         </w:rPr>
-        <w:t>2020 onward:</w:t>
+        <w:t>2019-2020:</w:t>
       </w:r>
       <w:r>
         <w:rPr>
           <w:b w:val="0"/>
         </w:rPr>
-        <w:t xml:space="preserve"> Dubai, digital-retail employment, COVID, and later crypto-merchant success.</w:t>
+        <w:t xml:space="preserve"> Roughly six months in Cameroon before the Dubai move; exact months open.</w:t>
       </w:r>
     </w:p>
     <w:p>
@@ -738,13 +738,13 @@
         <w:rPr>
           <w:b/>
         </w:rPr>
-        <w:t>Date to place:</w:t>
+        <w:t>2020 onward:</w:t>
       </w:r>
       <w:r>
         <w:rPr>
           <w:b w:val="0"/>
         </w:rPr>
-        <w:t xml:space="preserve"> Father's death after a snake bite while spraying cocoa; confirm Zino's age and the family aftermath.</w:t>
+        <w:t xml:space="preserve"> Dubai, digital-retail employment, COVID, and later crypto-merchant success.</w:t>
       </w:r>
     </w:p>
     <w:p>
@@ -764,7 +764,7 @@
         <w:rPr>
           <w:b w:val="0"/>
         </w:rPr>
-        <w:t xml:space="preserve"> Aunt's killing, loss of housing and farming income, relocation to Douala, and each reported jungle-justice incident.</w:t>
+        <w:t xml:space="preserve"> Aunt's killing, loss of housing and farming income, relocation to Douala, and individual jungle-justice incidents within the secondary-school years.</w:t>
       </w:r>
     </w:p>
     <w:p>
@@ -784,7 +784,7 @@
         <w:rPr>
           <w:b w:val="0"/>
         </w:rPr>
-        <w:t xml:space="preserve"> Professional School appears during secondary-school years; confirm the school, years, and whether the examination was the GCE or Government Common Entrance.</w:t>
+        <w:t xml:space="preserve"> Professional School is a vocational campus that opens classrooms at night during the secondary-school exam period. Confirm the school name and years; use Zino's remembered local terminology in dialogue.</w:t>
       </w:r>
     </w:p>
     <w:p>
@@ -928,7 +928,7 @@
         <w:rPr>
           <w:b w:val="0"/>
         </w:rPr>
-        <w:t>Street football introduces Zino's wit, competitiveness, and temper. Luc and Gideon, known as Gideo, hear his outrageous stories about Grand-Chukuchuku, the man who achieves what nobody else can. Brief fantasy sequences make those boasts visible before returning us to the real game. The compound is a small society: two families, three single mothers, two bachelors, and three student tenants share the well and mango tree. The landlord's monthly collection of rent and electricity money turns money into a recurring presence. Zino's mother, a primary-school teacher, believes in him. His father's death after a snake bite while spraying cocoa belongs as a memory once its date and Zino's age are confirmed.</w:t>
+        <w:t>Street football introduces Zino's wit, competitiveness, and temper. Luc and Gideon hear his outrageous stories about Grand-Chukuchuku, the man who achieves what nobody else can. Brief fantasy sequences make those boasts visible before returning us to the real game. The compound is a small society: two families, three single mothers, two bachelors, and three student tenants share the well and mango tree. The landlord's monthly collection of rent and electricity money turns money into a recurring presence. Zino's mother, a primary-school teacher, believes in him. His father died after a snake bite while spraying cocoa when Zino was two, so the loss enters through family history rather than a memory he owns.</w:t>
       </w:r>
     </w:p>
     <w:p>
@@ -963,7 +963,7 @@
         <w:rPr>
           <w:b w:val="0"/>
         </w:rPr>
-        <w:t>Education reveals both Zino's ability and the limits of that advantage. His earlier primary-school fee exclusion can return as a clearly placed memory; the later high-school exclusion belongs at its actual date. His mother's primary-school teaching income and his uncle's intermittent help keep opportunity alive without removing uncertainty. Boarding school in Kumba supplies comic escapes over the fence to eat at home. Each June, Professional School gives students evening time to revise, study in groups, socialize, or escape home; show its temptations without claiming every student is distracted. Zino also reports witnessing jungle justice in Fiango. Treat this as traumatic background, carried through fear and aftermath rather than graphic spectacle.</w:t>
+        <w:t>Education reveals both Zino's ability and the limits of that advantage. His earlier primary-school fee exclusion can return as a clearly placed memory; the later high-school exclusion belongs at its actual date. His mother's primary-school teaching income and his uncle's intermittent help keep opportunity alive without removing uncertainty. Boarding school in Kumba supplies comic escapes over the fence to eat at home. Each June, the daytime vocational school called Professional School opens classrooms at night for secondary-school students to revise, study in groups, socialize, or escape home; show its temptations without claiming every student is distracted. Zino's four reported encounters with jungle justice occur in these years. Feature them through a composite episode about fear and aftermath, not graphic spectacle.</w:t>
       </w:r>
     </w:p>
     <w:p>
@@ -1121,7 +1121,7 @@
         <w:rPr>
           <w:b w:val="0"/>
         </w:rPr>
-        <w:t>1. Which secondary school did you enter, when did boarding begin, and what is one defining memory of Luc, Gideon (Gideo), Elianne, or Miss Mukete?</w:t>
+        <w:t>1. Which secondary school did you enter, when did boarding begin, and what is one defining memory of Luc, Gideon, Elianne, or Miss Mukete?</w:t>
       </w:r>
     </w:p>
     <w:p>
@@ -1147,7 +1147,7 @@
         <w:rPr>
           <w:b w:val="0"/>
         </w:rPr>
-        <w:t>2. How old were you when your father died, and what do you remember directly versus what relatives told you?</w:t>
+        <w:t>2. Who told you the story of your father's death, and what details are most important for that family-history scene?</w:t>
       </w:r>
     </w:p>
     <w:p>
@@ -1255,7 +1255,7 @@
         <w:rPr>
           <w:b w:val="0"/>
         </w:rPr>
-        <w:t xml:space="preserve"> The opening is at ten, after primary completion in 1999. The age-ten fee scene remains a proposed composite. Confirm Zino's age at his father's death; confirm whether Gideo is Gideon's nickname; and distinguish GCE from Government Common Entrance before using Professional School in a dated scene.</w:t>
+        <w:t xml:space="preserve"> The opening is at ten, after primary completion in 1999. The age-ten fee scene remains a proposed composite. Zino's father died when he was two, so he has no firsthand memory of it. Professional School is a vocational campus that opens classrooms at night during the secondary-school exam period.</w:t>
       </w:r>
     </w:p>
     <w:p>

</xml_diff>

<commit_message>
Set hard-R violence direction
</commit_message>
<xml_diff>
--- a/series-development/editable/Grand-Chukuchuku_Editable_Outline.docx
+++ b/series-development/editable/Grand-Chukuchuku_Editable_Outline.docx
@@ -74,7 +74,7 @@
         <w:rPr>
           <w:b w:val="0"/>
         </w:rPr>
-        <w:t xml:space="preserve"> Animated thriller; 1-3 minute episodes; vertical 9:16 intended. Mature themes. English and Cameroon Pidgin, with English subtitles proposed.</w:t>
+        <w:t xml:space="preserve"> Hard-R animated thriller; 1-3 minute episodes; vertical 9:16 intended. English and Cameroon Pidgin, with English subtitles proposed.</w:t>
       </w:r>
     </w:p>
     <w:p>
@@ -112,7 +112,7 @@
         <w:rPr>
           <w:b w:val="0"/>
         </w:rPr>
-        <w:t xml:space="preserve"> Author-supplied voices; AI-assisted visuals. Original expressive 2D animation, with The Boondocks as a quality reference. Budget and release schedule remain open.</w:t>
+        <w:t xml:space="preserve"> Author-supplied voices; AI-assisted visuals. Original expressive 2D animation, with The Boondocks as a quality reference. Build a hard-R master, then make separate platform-release cuts where TikTok rules require them. Budget and release schedule remain open.</w:t>
       </w:r>
     </w:p>
     <w:p>
@@ -477,7 +477,7 @@
         <w:rPr>
           <w:b w:val="0"/>
         </w:rPr>
-        <w:t xml:space="preserve"> During his secondary-school years, Zino reports witnessing at least four incidents in Fiango in which people accused of theft were attacked by a crowd and burned with tires and fuel. This belongs in the story as traumatic exposure and a source of fear, silence, or moral conflict. Do not stage the violence as spectacle; use a composite episode that stays with consequence, sound, and moral uncertainty.</w:t>
+        <w:t xml:space="preserve"> During his secondary-school years, Zino reports witnessing at least four incidents in Fiango in which people accused of theft were attacked by a crowd and burned with tires and fuel. This is core hard-R material: depict the public brutality and its aftermath directly through Zino's witnessing. The accusation must remain unproven, and the scene must retain its moral weight rather than treat violence as proof of guilt.</w:t>
       </w:r>
     </w:p>
     <w:p>
@@ -963,7 +963,7 @@
         <w:rPr>
           <w:b w:val="0"/>
         </w:rPr>
-        <w:t>Education reveals both Zino's ability and the limits of that advantage. His earlier primary-school fee exclusion can return as a clearly placed memory; the later high-school exclusion belongs at its actual date. His mother's primary-school teaching income and his uncle's intermittent help keep opportunity alive without removing uncertainty. Boarding school in Kumba supplies comic escapes over the fence to eat at home. Each June, the daytime vocational school called Professional School opens classrooms at night for secondary-school students to revise, study in groups, socialize, or escape home; show its temptations without claiming every student is distracted. Zino's four reported encounters with jungle justice occur in these years. Feature them through a composite episode about fear and aftermath, not graphic spectacle.</w:t>
+        <w:t>Education reveals both Zino's ability and the limits of that advantage. His earlier primary-school fee exclusion can return as a clearly placed memory; the later high-school exclusion belongs at its actual date. His mother's primary-school teaching income and his uncle's intermittent help keep opportunity alive without removing uncertainty. Boarding school in Kumba supplies comic escapes over the fence to eat at home. Each June, the daytime vocational school called Professional School opens classrooms at night for secondary-school students to revise, study in groups, socialize, or escape home; show its temptations without claiming every student is distracted. Zino's four reported encounters with jungle justice occur in these years. Feature them through a hard-R composite episode that shows the crowd's brutality directly, then follows what Zino carries away from it.</w:t>
       </w:r>
     </w:p>
     <w:p>
@@ -1105,7 +1105,7 @@
         <w:rPr>
           <w:b w:val="0"/>
         </w:rPr>
-        <w:t xml:space="preserve"> After Zino witnesses the aftermath of an alleged thief being attacked, the episode stays with his fear, the adults' silence, and the question of justice rather than depicting the killing.</w:t>
+        <w:t xml:space="preserve"> Zino witnesses a hard-R composite of jungle justice: an accusation becomes public violence. The episode shows the brutality directly and ends with the fear, silence, and moral damage left behind.</w:t>
       </w:r>
     </w:p>
     <w:p>

</xml_diff>

<commit_message>
Correct Chapter One school timeline
</commit_message>
<xml_diff>
--- a/series-development/editable/Grand-Chukuchuku_Editable_Outline.docx
+++ b/series-development/editable/Grand-Chukuchuku_Editable_Outline.docx
@@ -171,7 +171,7 @@
         <w:rPr>
           <w:b w:val="0"/>
         </w:rPr>
-        <w:t>Zino is raised by his mother, a primary-school teacher. His father dies after a snake bite while spraying cocoa when Zino is two; in the family account, he passes out before reaching home. Zino has no direct memory of the loss. School-fee exclusions, boarding-school trips over the fence to eat at home, friendship, first love, and Miss Mukete's influence make education both hope and pressure. Professional School, a daytime vocational campus, opens its classrooms at night for secondary-school students to revise, socialize, and escape home. Zino completes secondary school in 2007 and his first degree in 2011. His uncle, friends, family, and a land sale make America possible.</w:t>
+        <w:t>Zino is raised by his mother, a primary-school teacher. His father dies after a snake bite while spraying cocoa when Zino is two; in the family account, he passes out before reaching home. Zino has no direct memory of the loss. Five years of day school in Fiango give him Luc, Gideon, Professional School, football, school-fee pressure, and Miss Mukete. Two final years at a remote boarding high school introduce mountains and valleys, a day-long journey from home, rich students, white teachers and priests, strict routine, bullying, and severe discipline. He witnesses students punished for jumping the fence to buy food. Zino completes secondary school in 2007 and his first degree in 2011. His uncle, friends, family, and a land sale make America possible.</w:t>
       </w:r>
     </w:p>
     <w:p>
@@ -471,6 +471,25 @@
         <w:rPr>
           <w:b/>
         </w:rPr>
+        <w:t>Boarding high school:</w:t>
+      </w:r>
+      <w:r>
+        <w:rPr>
+          <w:b w:val="0"/>
+        </w:rPr>
+        <w:t xml:space="preserve"> For the final two years before 2007, Zino attends a boarding high school in a remote village reached after a day of travel through mountains and valleys. It brings him into a new world of top students, wealthy parents, white teachers and priests, strict routine, discipline, bullying, and distance from home. He witnesses students punished after they jump the fence to buy food; do not make him the one who jumps.</w:t>
+      </w:r>
+    </w:p>
+    <w:p>
+      <w:r>
+        <w:rPr>
+          <w:b w:val="0"/>
+        </w:rPr>
+      </w:r>
+      <w:r>
+        <w:rPr>
+          <w:b/>
+        </w:rPr>
         <w:t>Jungle justice:</w:t>
       </w:r>
       <w:r>
@@ -584,7 +603,7 @@
         <w:rPr>
           <w:b w:val="0"/>
         </w:rPr>
-        <w:t xml:space="preserve"> Opening: Zino is ten, in Fiango, after primary school.</w:t>
+        <w:t xml:space="preserve"> Opening: Zino is ten, in Fiango, after primary school. Five years of day school begin, with Luc and Gideon.</w:t>
       </w:r>
     </w:p>
     <w:p>
@@ -598,13 +617,13 @@
         <w:rPr>
           <w:b/>
         </w:rPr>
-        <w:t>2007:</w:t>
-      </w:r>
-      <w:r>
-        <w:rPr>
-          <w:b w:val="0"/>
-        </w:rPr>
-        <w:t xml:space="preserve"> Secondary school completed; high-school fee exclusion has no exact date yet.</w:t>
+        <w:t>Around 2005:</w:t>
+      </w:r>
+      <w:r>
+        <w:rPr>
+          <w:b w:val="0"/>
+        </w:rPr>
+        <w:t xml:space="preserve"> Two years of high school begin at a remote boarding school reached after a day of travel through mountains and valleys.</w:t>
       </w:r>
     </w:p>
     <w:p>
@@ -618,13 +637,13 @@
         <w:rPr>
           <w:b/>
         </w:rPr>
-        <w:t>2011:</w:t>
-      </w:r>
-      <w:r>
-        <w:rPr>
-          <w:b w:val="0"/>
-        </w:rPr>
-        <w:t xml:space="preserve"> First degree completed; subject and institution need confirmation.</w:t>
+        <w:t>2007:</w:t>
+      </w:r>
+      <w:r>
+        <w:rPr>
+          <w:b w:val="0"/>
+        </w:rPr>
+        <w:t xml:space="preserve"> Two years of boarding high school complete the secondary-school period; the high-school fee exclusion has no exact date yet.</w:t>
       </w:r>
     </w:p>
     <w:p>
@@ -638,13 +657,13 @@
         <w:rPr>
           <w:b/>
         </w:rPr>
-        <w:t>2012:</w:t>
-      </w:r>
-      <w:r>
-        <w:rPr>
-          <w:b w:val="0"/>
-        </w:rPr>
-        <w:t xml:space="preserve"> Moves to the United States; Oklahoma and East Central University are identified.</w:t>
+        <w:t>2011:</w:t>
+      </w:r>
+      <w:r>
+        <w:rPr>
+          <w:b w:val="0"/>
+        </w:rPr>
+        <w:t xml:space="preserve"> First degree completed; subject and institution need confirmation.</w:t>
       </w:r>
     </w:p>
     <w:p>
@@ -658,13 +677,13 @@
         <w:rPr>
           <w:b/>
         </w:rPr>
-        <w:t>2014:</w:t>
-      </w:r>
-      <w:r>
-        <w:rPr>
-          <w:b w:val="0"/>
-        </w:rPr>
-        <w:t xml:space="preserve"> Master's completed; social-work studies identified; exact award title to confirm.</w:t>
+        <w:t>2012:</w:t>
+      </w:r>
+      <w:r>
+        <w:rPr>
+          <w:b w:val="0"/>
+        </w:rPr>
+        <w:t xml:space="preserve"> Moves to the United States; Oklahoma and East Central University are identified.</w:t>
       </w:r>
     </w:p>
     <w:p>
@@ -678,13 +697,13 @@
         <w:rPr>
           <w:b/>
         </w:rPr>
-        <w:t>Before 2019:</w:t>
-      </w:r>
-      <w:r>
-        <w:rPr>
-          <w:b w:val="0"/>
-        </w:rPr>
-        <w:t xml:space="preserve"> Nine-month course, three hackathon wins, Nkap, then njangi.xyz. Exact years open.</w:t>
+        <w:t>2014:</w:t>
+      </w:r>
+      <w:r>
+        <w:rPr>
+          <w:b w:val="0"/>
+        </w:rPr>
+        <w:t xml:space="preserve"> Master's completed; social-work studies identified; exact award title to confirm.</w:t>
       </w:r>
     </w:p>
     <w:p>
@@ -698,13 +717,13 @@
         <w:rPr>
           <w:b/>
         </w:rPr>
-        <w:t>2019:</w:t>
-      </w:r>
-      <w:r>
-        <w:rPr>
-          <w:b w:val="0"/>
-        </w:rPr>
-        <w:t xml:space="preserve"> Deportation for remaining without appropriate immigration documents.</w:t>
+        <w:t>Before 2019:</w:t>
+      </w:r>
+      <w:r>
+        <w:rPr>
+          <w:b w:val="0"/>
+        </w:rPr>
+        <w:t xml:space="preserve"> Nine-month course, three hackathon wins, Nkap, then njangi.xyz. Exact years open.</w:t>
       </w:r>
     </w:p>
     <w:p>
@@ -718,13 +737,13 @@
         <w:rPr>
           <w:b/>
         </w:rPr>
-        <w:t>2019-2020:</w:t>
-      </w:r>
-      <w:r>
-        <w:rPr>
-          <w:b w:val="0"/>
-        </w:rPr>
-        <w:t xml:space="preserve"> Roughly six months in Cameroon before the Dubai move; exact months open.</w:t>
+        <w:t>2019:</w:t>
+      </w:r>
+      <w:r>
+        <w:rPr>
+          <w:b w:val="0"/>
+        </w:rPr>
+        <w:t xml:space="preserve"> Deportation for remaining without appropriate immigration documents.</w:t>
       </w:r>
     </w:p>
     <w:p>
@@ -738,13 +757,13 @@
         <w:rPr>
           <w:b/>
         </w:rPr>
-        <w:t>2020 onward:</w:t>
-      </w:r>
-      <w:r>
-        <w:rPr>
-          <w:b w:val="0"/>
-        </w:rPr>
-        <w:t xml:space="preserve"> Dubai, digital-retail employment, COVID, and later crypto-merchant success.</w:t>
+        <w:t>2019-2020:</w:t>
+      </w:r>
+      <w:r>
+        <w:rPr>
+          <w:b w:val="0"/>
+        </w:rPr>
+        <w:t xml:space="preserve"> Roughly six months in Cameroon before the Dubai move; exact months open.</w:t>
       </w:r>
     </w:p>
     <w:p>
@@ -758,13 +777,13 @@
         <w:rPr>
           <w:b/>
         </w:rPr>
-        <w:t>Dates to place:</w:t>
-      </w:r>
-      <w:r>
-        <w:rPr>
-          <w:b w:val="0"/>
-        </w:rPr>
-        <w:t xml:space="preserve"> Aunt's killing, loss of housing and farming income, relocation to Douala, and individual jungle-justice incidents within the secondary-school years.</w:t>
+        <w:t>2020 onward:</w:t>
+      </w:r>
+      <w:r>
+        <w:rPr>
+          <w:b w:val="0"/>
+        </w:rPr>
+        <w:t xml:space="preserve"> Dubai, digital-retail employment, COVID, and later crypto-merchant success.</w:t>
       </w:r>
     </w:p>
     <w:p>
@@ -778,13 +797,33 @@
         <w:rPr>
           <w:b/>
         </w:rPr>
+        <w:t>Dates to place:</w:t>
+      </w:r>
+      <w:r>
+        <w:rPr>
+          <w:b w:val="0"/>
+        </w:rPr>
+        <w:t xml:space="preserve"> Aunt's killing, loss of housing and farming income, relocation to Douala, and individual jungle-justice incidents within the five day-school years.</w:t>
+      </w:r>
+    </w:p>
+    <w:p>
+      <w:r>
+        <w:rPr>
+          <w:b w:val="0"/>
+        </w:rPr>
+        <w:t xml:space="preserve">- </w:t>
+      </w:r>
+      <w:r>
+        <w:rPr>
+          <w:b/>
+        </w:rPr>
         <w:t>June study sessions:</w:t>
       </w:r>
       <w:r>
         <w:rPr>
           <w:b w:val="0"/>
         </w:rPr>
-        <w:t xml:space="preserve"> Professional School is a vocational campus that opens classrooms at night during the secondary-school exam period. Confirm the school name and years; use Zino's remembered local terminology in dialogue.</w:t>
+        <w:t xml:space="preserve"> Professional School is a vocational campus that opens classrooms at night during the day-school exam period. Confirm the school name and years; use Zino's remembered local terminology in dialogue.</w:t>
       </w:r>
     </w:p>
     <w:p>
@@ -836,7 +875,7 @@
         <w:rPr>
           <w:b w:val="0"/>
         </w:rPr>
-        <w:t xml:space="preserve"> Around 2000-2007, with earlier memories clearly identified</w:t>
+        <w:t xml:space="preserve"> Around 2000-2007: five day-school years, then two boarding high-school years</w:t>
       </w:r>
     </w:p>
     <w:p>
@@ -963,7 +1002,7 @@
         <w:rPr>
           <w:b w:val="0"/>
         </w:rPr>
-        <w:t>Education reveals both Zino's ability and the limits of that advantage. His earlier primary-school fee exclusion can return as a clearly placed memory; the later high-school exclusion belongs at its actual date. His mother's primary-school teaching income and his uncle's intermittent help keep opportunity alive without removing uncertainty. Boarding school in Kumba supplies comic escapes over the fence to eat at home. Each June, the daytime vocational school called Professional School opens classrooms at night for secondary-school students to revise, study in groups, socialize, or escape home; show its temptations without claiming every student is distracted. Zino's four reported encounters with jungle justice occur in these years. Feature them through a hard-R composite episode that shows the crowd's brutality directly, then follows what Zino carries away from it.</w:t>
+        <w:t>The first five years of day school give Zino daily life with Luc and Gideon. His earlier primary-school fee exclusion can return as a clearly placed memory; the later high-school exclusion belongs at its actual date. Each June, the daytime vocational school called Professional School opens classrooms at night for day-school students to revise, study in groups, socialize, or escape home; show its temptations without claiming every student is distracted. Zino's four reported encounters with jungle justice occur during these Fiango years. The final two high-school years move him to a remote village reached after a day of travel through mountains and valleys. Boarding school brings elite students, rich parents, white teachers and priests, rigid routine, bullying, and discipline. Zino witnesses students punished for jumping the fence to buy food; he is not the student jumping.</w:t>
       </w:r>
     </w:p>
     <w:p>
@@ -982,7 +1021,7 @@
         <w:rPr>
           <w:b w:val="0"/>
         </w:rPr>
-        <w:t xml:space="preserve"> Being the cleverest boy in the room does not guarantee that he can remain in it.</w:t>
+        <w:t xml:space="preserve"> Being clever does not make Zino safe when the rules, people, and distance from home all change.</w:t>
       </w:r>
     </w:p>
     <w:p>
@@ -1079,13 +1118,13 @@
         <w:rPr>
           <w:b/>
         </w:rPr>
-        <w:t>Professional School:</w:t>
-      </w:r>
-      <w:r>
-        <w:rPr>
-          <w:b w:val="0"/>
-        </w:rPr>
-        <w:t xml:space="preserve"> June evening revision creates a divided space: some students study; some pursue distraction; Zino must decide what kind of future he is preparing for.</w:t>
+        <w:t>The Crowd:</w:t>
+      </w:r>
+      <w:r>
+        <w:rPr>
+          <w:b w:val="0"/>
+        </w:rPr>
+        <w:t xml:space="preserve"> Zino witnesses a hard-R composite of jungle justice during the Fiango day-school years: an accusation becomes public violence. The episode shows the brutality directly and ends with the fear, silence, and moral damage left behind.</w:t>
       </w:r>
     </w:p>
     <w:p>
@@ -1099,13 +1138,33 @@
         <w:rPr>
           <w:b/>
         </w:rPr>
-        <w:t>The Crowd:</w:t>
-      </w:r>
-      <w:r>
-        <w:rPr>
-          <w:b w:val="0"/>
-        </w:rPr>
-        <w:t xml:space="preserve"> Zino witnesses a hard-R composite of jungle justice: an accusation becomes public violence. The episode shows the brutality directly and ends with the fear, silence, and moral damage left behind.</w:t>
+        <w:t>The Long Road:</w:t>
+      </w:r>
+      <w:r>
+        <w:rPr>
+          <w:b w:val="0"/>
+        </w:rPr>
+        <w:t xml:space="preserve"> A day-long trip through mountains and valleys takes Zino to boarding school, where distance, wealth, routine, bullying, and strict discipline change the rules of his life.</w:t>
+      </w:r>
+    </w:p>
+    <w:p>
+      <w:r>
+        <w:rPr>
+          <w:b w:val="0"/>
+        </w:rPr>
+        <w:t xml:space="preserve">5. </w:t>
+      </w:r>
+      <w:r>
+        <w:rPr>
+          <w:b/>
+        </w:rPr>
+        <w:t>The Fence:</w:t>
+      </w:r>
+      <w:r>
+        <w:rPr>
+          <w:b w:val="0"/>
+        </w:rPr>
+        <w:t xml:space="preserve"> Zino witnesses students punished after jumping the boarding-school fence to buy food. The episode makes clear that he does not jump, while showing how hunger, fear, and discipline shape the whole dormitory.</w:t>
       </w:r>
     </w:p>
     <w:p>
@@ -1121,7 +1180,7 @@
         <w:rPr>
           <w:b w:val="0"/>
         </w:rPr>
-        <w:t>1. Which secondary school did you enter, when did boarding begin, and what is one defining memory of Luc, Gideon, Elianne, or Miss Mukete?</w:t>
+        <w:t>1. Which day school did you attend with Luc and Gideon, when did boarding begin, and what is one defining memory of Luc, Gideon, Elianne, or Miss Mukete?</w:t>
       </w:r>
     </w:p>
     <w:p>
@@ -1173,7 +1232,7 @@
         <w:rPr>
           <w:b w:val="0"/>
         </w:rPr>
-        <w:t>3. What did Professional School mean in your school, which exam was it for, and what is one evening you remember?</w:t>
+        <w:t>3. What did Professional School mean in your day school, which exam was it for, and what is one evening or jungle-justice incident you remember most clearly?</w:t>
       </w:r>
     </w:p>
     <w:p>
@@ -1199,7 +1258,7 @@
         <w:rPr>
           <w:b w:val="0"/>
         </w:rPr>
-        <w:t>4. For each jungle-justice incident, what did you witness directly, how old were you, and what effect did it have on you?</w:t>
+        <w:t>4. What was the boarding school's name, how did you travel there, and what did the mountains, valleys, dormitories, teachers, priests, bullying, and punishment feel like?</w:t>
       </w:r>
     </w:p>
     <w:p>
@@ -1255,7 +1314,7 @@
         <w:rPr>
           <w:b w:val="0"/>
         </w:rPr>
-        <w:t xml:space="preserve"> The opening is at ten, after primary completion in 1999. The age-ten fee scene remains a proposed composite. Zino's father died when he was two, so he has no firsthand memory of it. Professional School is a vocational campus that opens classrooms at night during the secondary-school exam period.</w:t>
+        <w:t xml:space="preserve"> The first five years are Fiango day school with Luc and Gideon; the final two are remote boarding high school. Professional School belongs in day school. Zino witnessed, rather than joined, the fence punishments.</w:t>
       </w:r>
     </w:p>
     <w:p>

</xml_diff>

<commit_message>
Add GCE milestones and radio result scenes
</commit_message>
<xml_diff>
--- a/series-development/editable/Grand-Chukuchuku_Editable_Outline.docx
+++ b/series-development/editable/Grand-Chukuchuku_Editable_Outline.docx
@@ -171,7 +171,7 @@
         <w:rPr>
           <w:b w:val="0"/>
         </w:rPr>
-        <w:t>Zino is raised by his mother, a primary-school teacher. His father dies after a snake bite while spraying cocoa when Zino is two; in the family account, he passes out before reaching home. Zino has no direct memory of the loss. Five years of day school in Fiango give him Luc, Gideon, Professional School, football, school-fee pressure, and Miss Mukete. Two final years at a remote boarding high school introduce mountains and valleys, a day-long journey from home, rich students, white teachers and priests, strict routine, bullying, and severe discipline. He witnesses students punished for jumping the fence to buy food. Zino completes secondary school in 2007 and his first degree in 2011. His uncle, friends, family, and a land sale make America possible.</w:t>
+        <w:t>Zino is raised by his mother, a primary-school teacher. His father dies after a snake bite while spraying cocoa when Zino is two; in the family account, he passes out before reaching home. Zino has no direct memory of the loss. Five Fiango day-school years give him Luc, Gideon, Professional School, football, school-fee pressure, and Miss Mukete. He writes ten GCE Ordinary-Level subjects, then waits for the radio results. Two remote boarding years bring mountains and valleys, a day-long journey from home, rich students, white teachers and priests, strict routine, bullying, and severe discipline. He witnesses students punished for jumping the fence to buy food. He writes five GCE Advanced-Level subjects; his school records a 100% pass rate. The radio reading and celebration mark his 2007 completion.</w:t>
       </w:r>
     </w:p>
     <w:p>
@@ -623,7 +623,7 @@
         <w:rPr>
           <w:b w:val="0"/>
         </w:rPr>
-        <w:t xml:space="preserve"> Two years of high school begin at a remote boarding school reached after a day of travel through mountains and valleys.</w:t>
+        <w:t xml:space="preserve"> Five years of Fiango day school end with ten GCE Ordinary-Level subjects (maximum 11) and radio results. Two years of high school then begin at a remote boarding school reached after a day of travel through mountains and valleys.</w:t>
       </w:r>
     </w:p>
     <w:p>
@@ -643,7 +643,7 @@
         <w:rPr>
           <w:b w:val="0"/>
         </w:rPr>
-        <w:t xml:space="preserve"> Two years of boarding high school complete the secondary-school period; the high-school fee exclusion has no exact date yet.</w:t>
+        <w:t xml:space="preserve"> Boarding high school ends with five GCE Advanced-Level subjects (maximum 5), forming Zino's university study area. His school has a 100% Advanced-Level pass rate; radio results and celebration mark the completion of the secondary-school period.</w:t>
       </w:r>
     </w:p>
     <w:p>
@@ -1002,7 +1002,7 @@
         <w:rPr>
           <w:b w:val="0"/>
         </w:rPr>
-        <w:t>The first five years of day school give Zino daily life with Luc and Gideon. His earlier primary-school fee exclusion can return as a clearly placed memory; the later high-school exclusion belongs at its actual date. Each June, the daytime vocational school called Professional School opens classrooms at night for day-school students to revise, study in groups, socialize, or escape home; show its temptations without claiming every student is distracted. Zino's four reported encounters with jungle justice occur during these Fiango years. The final two high-school years move him to a remote village reached after a day of travel through mountains and valleys. Boarding school brings elite students, rich parents, white teachers and priests, rigid routine, bullying, and discipline. Zino witnesses students punished for jumping the fence to buy food; he is not the student jumping.</w:t>
+        <w:t>The first five years of day school give Zino daily life with Luc and Gideon. His earlier primary-school fee exclusion can return as a clearly placed memory; the later high-school exclusion belongs at its actual date. Each June, the daytime vocational school called Professional School opens classrooms at night for day-school students to revise, study in groups, socialize, or escape home; show its temptations without claiming every student is distracted. Zino's four reported encounters with jungle justice occur during these Fiango years. At the end of the five years, he writes ten GCE Ordinary-Level subjects, from a possible maximum of eleven. Results are read on the radio, turning the wait into a shared public ordeal and the result into celebration.</w:t>
       </w:r>
     </w:p>
     <w:p>
@@ -1021,7 +1021,7 @@
         <w:rPr>
           <w:b w:val="0"/>
         </w:rPr>
-        <w:t xml:space="preserve"> Being clever does not make Zino safe when the rules, people, and distance from home all change.</w:t>
+        <w:t xml:space="preserve"> The first result opens a road forward, but it sends Zino farther from everything familiar.</w:t>
       </w:r>
     </w:p>
     <w:p>
@@ -1037,7 +1037,7 @@
         <w:rPr>
           <w:b w:val="0"/>
         </w:rPr>
-        <w:t>Zino completes secondary school in 2007. Academic progress creates a new threshold rather than financial security. The closing movement should grow from a remembered examination, result, or family conversation, making clear what this achievement means to him and his mother. Grand-Chukuchuku can still supply effortless victories; Zino's real future requires help, patience, and choices. The child who dreams of lifting his mother out of hardship now faces the practical requirements of further education. The chapter ends with a milestone achieved and the next opportunity still uncertain.</w:t>
+        <w:t>The final two high-school years move Zino to a remote village reached after a day of travel through mountains and valleys. Boarding school brings elite students, rich parents, white teachers and priests, rigid routine, bullying, and discipline. Zino witnesses students punished for jumping the fence to buy food; he is not the student jumping. At the end, he writes five GCE Advanced-Level subjects, the maximum and his university study area. His school has a 100% Advanced-Level pass rate, so Zino is not waiting in fear of failure; the radio reading of names and the celebration give the result its emotional force. He completes secondary school in 2007, but education still requires money.</w:t>
       </w:r>
     </w:p>
     <w:p>
@@ -1056,7 +1056,7 @@
         <w:rPr>
           <w:b w:val="0"/>
         </w:rPr>
-        <w:t xml:space="preserve"> He has the ability to continue, but the household still needs a way to pay.</w:t>
+        <w:t xml:space="preserve"> He has the qualification to continue, but the household still needs a way to pay.</w:t>
       </w:r>
     </w:p>
     <w:p>
@@ -1138,13 +1138,13 @@
         <w:rPr>
           <w:b/>
         </w:rPr>
-        <w:t>The Long Road:</w:t>
-      </w:r>
-      <w:r>
-        <w:rPr>
-          <w:b w:val="0"/>
-        </w:rPr>
-        <w:t xml:space="preserve"> A day-long trip through mountains and valleys takes Zino to boarding school, where distance, wealth, routine, bullying, and strict discipline change the rules of his life.</w:t>
+        <w:t>Results on Air:</w:t>
+      </w:r>
+      <w:r>
+        <w:rPr>
+          <w:b w:val="0"/>
+        </w:rPr>
+        <w:t xml:space="preserve"> The GCE Ordinary-Level and Advanced-Level result days make the radio a public stage for dread, names, relief, joy, and celebration. Zino writes ten Ordinary-Level and five Advanced-Level subjects.</w:t>
       </w:r>
     </w:p>
     <w:p>
@@ -1180,7 +1180,7 @@
         <w:rPr>
           <w:b w:val="0"/>
         </w:rPr>
-        <w:t>1. Which day school did you attend with Luc and Gideon, when did boarding begin, and what is one defining memory of Luc, Gideon, Elianne, or Miss Mukete?</w:t>
+        <w:t>1. Which day school did you attend with Luc and Gideon, what were your ten Ordinary-Level subjects, and what is one defining memory of Luc, Gideon, Elianne, or Miss Mukete?</w:t>
       </w:r>
     </w:p>
     <w:p>
@@ -1258,7 +1258,7 @@
         <w:rPr>
           <w:b w:val="0"/>
         </w:rPr>
-        <w:t>4. What was the boarding school's name, how did you travel there, and what did the mountains, valleys, dormitories, teachers, priests, bullying, and punishment feel like?</w:t>
+        <w:t>4. What was the boarding school's name, how did you travel there, what were your five Advanced-Level subjects, and who was present around the radio when the results were read?</w:t>
       </w:r>
     </w:p>
     <w:p>
@@ -1314,7 +1314,7 @@
         <w:rPr>
           <w:b w:val="0"/>
         </w:rPr>
-        <w:t xml:space="preserve"> The first five years are Fiango day school with Luc and Gideon; the final two are remote boarding high school. Professional School belongs in day school. Zino witnessed, rather than joined, the fence punishments.</w:t>
+        <w:t xml:space="preserve"> Five day-school years end in ten Ordinary Levels; two boarding years end in five Advanced Levels and radio results. Zino witnessed the fence punishments.</w:t>
       </w:r>
     </w:p>
     <w:p>

</xml_diff>

<commit_message>
Add uncle promise to education arc
</commit_message>
<xml_diff>
--- a/series-development/editable/Grand-Chukuchuku_Editable_Outline.docx
+++ b/series-development/editable/Grand-Chukuchuku_Editable_Outline.docx
@@ -171,7 +171,7 @@
         <w:rPr>
           <w:b w:val="0"/>
         </w:rPr>
-        <w:t>Zino is raised by his mother, a primary-school teacher. His father dies after a snake bite while spraying cocoa when Zino is two; in the family account, he passes out before reaching home. Zino has no direct memory of the loss. Five Fiango day-school years give him Luc, Gideon, Professional School, football, school-fee pressure, and Miss Mukete. He writes ten GCE Ordinary-Level subjects, then waits for the radio results. Two remote boarding years bring mountains and valleys, a day-long journey from home, rich students, white teachers and priests, strict routine, bullying, and severe discipline. He witnesses students punished for jumping the fence to buy food. He writes five GCE Advanced-Level subjects; his school records a 100% pass rate. The radio reading and celebration mark his 2007 completion.</w:t>
+        <w:t>Zino is raised by his mother, a primary-school teacher. His father dies after a snake bite while spraying cocoa when Zino is two; in the family account, he passes out before reaching home. Zino has no direct memory of the loss. Five Fiango day-school years give him Luc, Gideon, Professional School, football, school-fee pressure, and Miss Mukete. After ten GCE Ordinary-Level subjects and radio results, his proud uncle promises he can choose any school and go to America if he succeeds in all five Advanced-Level subjects. Zino chooses remote boarding school. After two hard years, he writes five Advanced Levels; the school has a 100% pass rate. When Zino reminds his uncle about America, the promise moves: first he must earn a university degree.</w:t>
       </w:r>
     </w:p>
     <w:p>
@@ -279,7 +279,7 @@
         <w:rPr>
           <w:b w:val="0"/>
         </w:rPr>
-        <w:t xml:space="preserve"> Provides occasional school-fee support and helps make America possible. His precise contributions and relationship with Zino need expansion; no financial conditions or motives have been established.</w:t>
+        <w:t xml:space="preserve"> Provides occasional school-fee support. Proud of Zino's Ordinary-Level results, he promises that Zino can choose any school and go to America if he succeeds in all five Advanced-Level subjects. Zino chooses boarding school on that basis. After the A Levels, the uncle defers America until Zino completes a first university degree. His exact words, contributions, and reasons remain to be developed.</w:t>
       </w:r>
     </w:p>
     <w:p>
@@ -623,7 +623,7 @@
         <w:rPr>
           <w:b w:val="0"/>
         </w:rPr>
-        <w:t xml:space="preserve"> Five years of Fiango day school end with ten GCE Ordinary-Level subjects (maximum 11) and radio results. Two years of high school then begin at a remote boarding school reached after a day of travel through mountains and valleys.</w:t>
+        <w:t xml:space="preserve"> Five years of Fiango day school end with ten GCE Ordinary-Level subjects (maximum 11) and radio results. Zino's uncle promises school choice and America if Zino succeeds in all five Advanced-Level subjects; Zino chooses a remote boarding school.</w:t>
       </w:r>
     </w:p>
     <w:p>
@@ -643,7 +643,7 @@
         <w:rPr>
           <w:b w:val="0"/>
         </w:rPr>
-        <w:t xml:space="preserve"> Boarding high school ends with five GCE Advanced-Level subjects (maximum 5), forming Zino's university study area. His school has a 100% Advanced-Level pass rate; radio results and celebration mark the completion of the secondary-school period.</w:t>
+        <w:t xml:space="preserve"> Boarding high school ends with five GCE Advanced-Level subjects (maximum 5), forming Zino's university study area. His school has a 100% Advanced-Level pass rate. When Zino recalls the America promise, his uncle defers it until Zino completes a first university degree.</w:t>
       </w:r>
     </w:p>
     <w:p>
@@ -1002,7 +1002,7 @@
         <w:rPr>
           <w:b w:val="0"/>
         </w:rPr>
-        <w:t>The first five years of day school give Zino daily life with Luc and Gideon. His earlier primary-school fee exclusion can return as a clearly placed memory; the later high-school exclusion belongs at its actual date. Each June, the daytime vocational school called Professional School opens classrooms at night for day-school students to revise, study in groups, socialize, or escape home; show its temptations without claiming every student is distracted. Zino's four reported encounters with jungle justice occur during these Fiango years. At the end of the five years, he writes ten GCE Ordinary-Level subjects, from a possible maximum of eleven. Results are read on the radio, turning the wait into a shared public ordeal and the result into celebration.</w:t>
+        <w:t>The first five years of day school give Zino daily life with Luc and Gideon. His earlier primary-school fee exclusion can return as a clearly placed memory; the later high-school exclusion belongs at its actual date. Each June, the daytime vocational school called Professional School opens classrooms at night for day-school students to revise, study in groups, socialize, or escape home; show its temptations without claiming every student is distracted. Zino's four reported encounters with jungle justice occur during these Fiango years. At the end of the five years, he writes ten GCE Ordinary-Level subjects, from a possible maximum of eleven. Proud of the result, his uncle promises that Zino can choose any school and go to America if he succeeds in all five Advanced-Level subjects. Zino chooses boarding school.</w:t>
       </w:r>
     </w:p>
     <w:p>
@@ -1021,7 +1021,7 @@
         <w:rPr>
           <w:b w:val="0"/>
         </w:rPr>
-        <w:t xml:space="preserve"> The first result opens a road forward, but it sends Zino farther from everything familiar.</w:t>
+        <w:t xml:space="preserve"> The first result turns an uncle's pride into a promise strong enough to send Zino far from home.</w:t>
       </w:r>
     </w:p>
     <w:p>
@@ -1037,7 +1037,7 @@
         <w:rPr>
           <w:b w:val="0"/>
         </w:rPr>
-        <w:t>The final two high-school years move Zino to a remote village reached after a day of travel through mountains and valleys. Boarding school brings elite students, rich parents, white teachers and priests, rigid routine, bullying, and discipline. Zino witnesses students punished for jumping the fence to buy food; he is not the student jumping. At the end, he writes five GCE Advanced-Level subjects, the maximum and his university study area. His school has a 100% Advanced-Level pass rate, so Zino is not waiting in fear of failure; the radio reading of names and the celebration give the result its emotional force. He completes secondary school in 2007, but education still requires money.</w:t>
+        <w:t>The final two high-school years move Zino to a remote village reached after a day of travel through mountains and valleys. Boarding school brings elite students, rich parents, white teachers and priests, rigid routine, bullying, and discipline. Zino witnesses students punished for jumping the fence to buy food; he is not the student jumping. At the end, he writes five GCE Advanced-Level subjects, the maximum and his university study area. His school has a 100% Advanced-Level pass rate, so the radio result brings celebration rather than fear of failing. When Zino reminds his uncle about America, the uncle moves the promise: first Zino must complete a university degree.</w:t>
       </w:r>
     </w:p>
     <w:p>
@@ -1056,7 +1056,7 @@
         <w:rPr>
           <w:b w:val="0"/>
         </w:rPr>
-        <w:t xml:space="preserve"> He has the qualification to continue, but the household still needs a way to pay.</w:t>
+        <w:t xml:space="preserve"> Zino has met the condition, but the goalpost moves and the next dream becomes a longer journey.</w:t>
       </w:r>
     </w:p>
     <w:p>
@@ -1144,7 +1144,7 @@
         <w:rPr>
           <w:b w:val="0"/>
         </w:rPr>
-        <w:t xml:space="preserve"> The GCE Ordinary-Level and Advanced-Level result days make the radio a public stage for dread, names, relief, joy, and celebration. Zino writes ten Ordinary-Level and five Advanced-Level subjects.</w:t>
+        <w:t xml:space="preserve"> The radio makes the GCE result days public. Ten Ordinary Levels bring Zino an uncle's promise of school choice and America after five Advanced Levels; the later promise is deferred until after university.</w:t>
       </w:r>
     </w:p>
     <w:p>
@@ -1206,7 +1206,7 @@
         <w:rPr>
           <w:b w:val="0"/>
         </w:rPr>
-        <w:t>2. Who told you the story of your father's death, and what details are most important for that family-history scene?</w:t>
+        <w:t>2. What exact words did your uncle use after the Ordinary Levels, and how did you decide to take him up on the boarding-school offer?</w:t>
       </w:r>
     </w:p>
     <w:p>
@@ -1258,7 +1258,7 @@
         <w:rPr>
           <w:b w:val="0"/>
         </w:rPr>
-        <w:t>4. What was the boarding school's name, how did you travel there, what were your five Advanced-Level subjects, and who was present around the radio when the results were read?</w:t>
+        <w:t>4. What was the boarding school's name, how did you travel there, what were your five Advanced-Level subjects, and how did your uncle explain the change to his America promise?</w:t>
       </w:r>
     </w:p>
     <w:p>
@@ -1314,7 +1314,7 @@
         <w:rPr>
           <w:b w:val="0"/>
         </w:rPr>
-        <w:t xml:space="preserve"> Five day-school years end in ten Ordinary Levels; two boarding years end in five Advanced Levels and radio results. Zino witnessed the fence punishments.</w:t>
+        <w:t xml:space="preserve"> Ordinary Levels earn an America promise; Advanced Levels defer it until after university. Zino witnessed the fence punishments.</w:t>
       </w:r>
     </w:p>
     <w:p>
@@ -1438,7 +1438,7 @@
         <w:rPr>
           <w:b w:val="0"/>
         </w:rPr>
-        <w:t>Zino enters the next stage of his education with ability, ambition, and financial uncertainty. The dream of America begins to require concrete qualifications and preparations. His mother believes in him; his paternal uncle remains an important source of help. Elianne's place in this period should follow the actual relationship timeline, bringing intimacy and a competing sense of what a future might look like. Study, romance, family expectations, and the dream of nursing belong together only where his memories connect them. Childhood confidence must now become a workable plan.</w:t>
+        <w:t>Zino enters the next stage of his education with ability, ambition, and financial uncertainty. After the Advanced Levels, he reminds his uncle of the America promise made after his Ordinary-Level results. His uncle changes the sequence: Zino must first earn a university degree. That deferral gives higher education a concrete purpose beyond ambition. His mother believes in him; his uncle remains important support. Elianne's place in this period should follow the actual relationship timeline. Study, romance, family expectations, and the dream of nursing belong together only where his memories connect them.</w:t>
       </w:r>
     </w:p>
     <w:p>
@@ -1457,7 +1457,7 @@
         <w:rPr>
           <w:b w:val="0"/>
         </w:rPr>
-        <w:t xml:space="preserve"> America becomes a practical possibility rather than a story about someday.</w:t>
+        <w:t xml:space="preserve"> America remains possible, but only if Zino can first complete the new condition.</w:t>
       </w:r>
     </w:p>
     <w:p>

</xml_diff>

<commit_message>
Integrate Fiango daily life, classmates, uniforms and family context
</commit_message>
<xml_diff>
--- a/series-development/editable/Grand-Chukuchuku_Editable_Outline.docx
+++ b/series-development/editable/Grand-Chukuchuku_Editable_Outline.docx
@@ -31,7 +31,7 @@
         <w:rPr>
           <w:b w:val="0"/>
         </w:rPr>
-        <w:t>Development draft: 28 October 2026</w:t>
+        <w:t>Development draft: 30 October 2026</w:t>
       </w:r>
     </w:p>
     <w:p>
@@ -279,7 +279,7 @@
         <w:rPr>
           <w:b w:val="0"/>
         </w:rPr>
-        <w:t xml:space="preserve"> Provides occasional school-fee support. Proud of Zino's Ordinary-Level results, he promises that Zino can choose any school and go to America if he succeeds in all five Advanced-Level subjects. Zino chooses boarding school on that basis. After the A Levels, the uncle defers America until Zino completes a first university degree. His exact words, contributions, and reasons remain to be developed.</w:t>
+        <w:t xml:space="preserve"> A renowned lawyer known for suits, later a Christian convert and cocoa trader. By Form Three he has a large Kumba store shipping trailers to Douala. He supports school at times, promises America after five A-Levels, then defers until a first degree. Legal/trading overlap, payment timing and deferral reasons remain open. He loved Zino's father; his advice about avoiding the father's path is his reported judgement, not a verdict on farming.</w:t>
       </w:r>
     </w:p>
     <w:p>
@@ -298,7 +298,7 @@
         <w:rPr>
           <w:b w:val="0"/>
         </w:rPr>
-        <w:t xml:space="preserve"> Sharp, business-minded, and always looking for a way to make money. He buys his first camera in secondary school and often pays when he and Zino go out. He values Zino's company because Zino can talk to girls, while Gideon's quietness leaves girls feeling bored.</w:t>
+        <w:t xml:space="preserve"> Business-minded, buys his first camera in secondary school, seeks birthday gigs and often pays for outings. Does not play football: sits watching and bantering, especially when Zino loses. Quiet with girls; loves Sophy in Forms Two-Five. Zino declines her advances from loyalty.</w:t>
       </w:r>
     </w:p>
     <w:p>
@@ -317,7 +317,7 @@
         <w:rPr>
           <w:b w:val="0"/>
         </w:rPr>
-        <w:t xml:space="preserve"> God-fearing, funny, candid, and often carrying a small Gideons Bible. He approaches students to preach. He values Zino's directness, help with maths, and ability to talk openly about girls. Confirm the preferred Bible wording and his age in these memories.</w:t>
+        <w:t xml:space="preserve"> God-fearing, carries a small Bible and preaches to students. Does not play football; evangelises or chats. Values Zino's honesty, maths help and humour. The friendship must not turn him into an invented teammate or default referee.</w:t>
       </w:r>
     </w:p>
     <w:p>
@@ -330,13 +330,13 @@
         <w:rPr>
           <w:b/>
         </w:rPr>
-        <w:t>Elianne and Miss Mukete:</w:t>
-      </w:r>
-      <w:r>
-        <w:rPr>
-          <w:b w:val="0"/>
-        </w:rPr>
-        <w:t xml:space="preserve"> Elianne is Zino's first love. Miss Mukete is his favorite chemistry teacher. Establish when each enters his life and the specific memories that define their influence.</w:t>
+        <w:t>School relationships / Miss Mukete:</w:t>
+      </w:r>
+      <w:r>
+        <w:rPr>
+          <w:b w:val="0"/>
+        </w:rPr>
+        <w:t xml:space="preserve"> Lizzy: Form One crush, girlfriend from Two, breakup in Three. Mirabel: maths friendship from Three until U.S. departure. Elianne was previously called first love; identity/place is unresolved, so do not merge her with Lizzy. Miss Mukete is the favourite chemistry teacher. New details and neutral Tracey notes are in the Fiango update.</w:t>
       </w:r>
     </w:p>
     <w:p>
@@ -439,7 +439,7 @@
         <w:rPr>
           <w:b w:val="0"/>
         </w:rPr>
-        <w:t xml:space="preserve"> Two families, three single mothers, two bachelors, and three students rent within the compound. The shared well, mango tree, monthly rent, and electricity collection make it a living social system, not just a backdrop.</w:t>
+        <w:t xml:space="preserve"> Two families, three single mothers, two bachelors and three students share a well, mango tree and two bathrooms. Zino's room is two apartments from Mother's front room. At 5:30 he fetches four buckets in two trips. The drawer usually holds 200 CFA: 100 taxi/100 school, or walk early and retain 200. Taxi on three mornings weekly.</w:t>
       </w:r>
     </w:p>
     <w:p>
@@ -458,7 +458,7 @@
         <w:rPr>
           <w:b w:val="0"/>
         </w:rPr>
-        <w:t xml:space="preserve"> A real vocational school active in daytime for building, construction, and electrical training. During the secondary-school years, its classrooms open at night around June for students to revise for the exam period. Some read alone or in groups; others use the gathering to socialize, smoke, drink, court girls, or simply escape home. Treat the setting as varied: it is not true that every student misbehaves.</w:t>
+        <w:t xml:space="preserve"> A working vocational campus for building, construction and electrical training. Around June, classrooms open at night for secondary-school exam revision. Genuine individual/group study coexists with socialising, distractions and a pretext to leave home; not every student misbehaves.</w:t>
       </w:r>
     </w:p>
     <w:p>
@@ -477,7 +477,7 @@
         <w:rPr>
           <w:b w:val="0"/>
         </w:rPr>
-        <w:t xml:space="preserve"> For the final two years before 2007, Zino attends a boarding high school in a remote village reached after a day of travel through mountains and valleys. It brings him into a new world of top students, wealthy parents, white teachers and priests, strict routine, discipline, bullying, and distance from home. He witnesses students punished after they jump the fence to buy food; do not make him the one who jumps.</w:t>
+        <w:t xml:space="preserve"> Two high-school years before 2007, in a remote village a day away across mountains and valleys. Elite students, wealthy parents, white teachers and priests, discipline and bullying change Zino's world. He witnesses punishments after students jump the fence to buy food; he does not jump himself.</w:t>
       </w:r>
     </w:p>
     <w:p>
@@ -496,7 +496,7 @@
         <w:rPr>
           <w:b w:val="0"/>
         </w:rPr>
-        <w:t xml:space="preserve"> During his secondary-school years, Zino reports witnessing at least four incidents in Fiango in which people accused of theft were attacked by a crowd and burned with tires and fuel. This is core hard-R material: depict the public brutality and its aftermath directly through Zino's witnessing. The accusation must remain unproven, and the scene must retain its moral weight rather than treat violence as proof of guilt.</w:t>
+        <w:t xml:space="preserve"> Zino reports witnessing at least four secondary-school incidents: crowds attack people accused of theft and burn them with tires and fuel. Depict physical harm and aftermath through his witness perspective. Accusation is never proof of guilt; an individual event's names, dates and sequence need his recollection.</w:t>
       </w:r>
     </w:p>
     <w:p>
@@ -515,7 +515,7 @@
         <w:rPr>
           <w:b w:val="0"/>
         </w:rPr>
-        <w:t xml:space="preserve"> Food, church, football, music, school routines, discipline, slang, celebrations, neighborhood life, and the sound of the landlord's monthly visit can keep the world specific and alive.</w:t>
+        <w:t xml:space="preserve"> Ayuk, Arey, Noge, Bismark and Robi play football; Luc/Gideon do not. Children first watch TV through an adjacent barred window, later at Ayuk's during secondary school. The tarred pickup road is five houses behind, near five-storey Azi Motel and Mother's aunt's poultry farm. Uniform: sky-blue short sleeves, dark-blue trousers/skirts.</w:t>
       </w:r>
     </w:p>
     <w:p>

</xml_diff>

<commit_message>
Update Fiango character designs, music history and story continuity
</commit_message>
<xml_diff>
--- a/series-development/editable/Grand-Chukuchuku_Editable_Outline.docx
+++ b/series-development/editable/Grand-Chukuchuku_Editable_Outline.docx
@@ -222,7 +222,7 @@
         <w:rPr>
           <w:b w:val="0"/>
         </w:rPr>
-        <w:t xml:space="preserve"> Born in 1990. Intelligent, witty, talented, kind, and strongly concerned with justice. Temper, people-pleasing, and limited self-awareness complicate his decisions. He wants success and happiness, with a house for his mother as the enduring goal.</w:t>
+        <w:t xml:space="preserve"> Born 1990; witty, kind, just, with temper and people-pleasing flaws. Maths feels like a puzzle; science comes readily. Catholic, primary-school altar server; secondary demands end service. Sings, writes songs from Form Five; first demo after boarding high school, later writing in America. Wants a house for Mother.</w:t>
       </w:r>
     </w:p>
     <w:p>
@@ -292,13 +292,13 @@
         <w:rPr>
           <w:b/>
         </w:rPr>
-        <w:t>Gideon:</w:t>
-      </w:r>
-      <w:r>
-        <w:rPr>
-          <w:b w:val="0"/>
-        </w:rPr>
-        <w:t xml:space="preserve"> Business-minded, buys his first camera in secondary school, seeks birthday gigs and often pays for outings. Does not play football: sits watching and bantering, especially when Zino loses. Quiet with girls; loves Sophy in Forms Two-Five. Zino declines her advances from loyalty.</w:t>
+        <w:t>Gideon / Giddy:</w:t>
+      </w:r>
+      <w:r>
+        <w:rPr>
+          <w:b w:val="0"/>
+        </w:rPr>
+        <w:t xml:space="preserve"> W-shaped hairline, fuller almost-afro. Camera gigs, trades and paid services; a market bread place by Form Five. Often pays; asks Zino for schoolwork help. Quiet with girls; loves Sophy in Forms Two-Five. Watches and banters beside football; does not play.</w:t>
       </w:r>
     </w:p>
     <w:p>
@@ -311,13 +311,13 @@
         <w:rPr>
           <w:b/>
         </w:rPr>
-        <w:t>Luc:</w:t>
-      </w:r>
-      <w:r>
-        <w:rPr>
-          <w:b w:val="0"/>
-        </w:rPr>
-        <w:t xml:space="preserve"> God-fearing, carries a small Bible and preaches to students. Does not play football; evangelises or chats. Values Zino's honesty, maths help and humour. The friendship must not turn him into an invented teammate or default referee.</w:t>
+        <w:t>Luc / Lucky Luc:</w:t>
+      </w:r>
+      <w:r>
+        <w:rPr>
+          <w:b w:val="0"/>
+        </w:rPr>
+        <w:t xml:space="preserve"> God-fearing, small Bible, school preaching; no football. Muscular from evening mud-formed dumbbells and sandbag training; high flat-top. Zino's maths help and humour matter. Lucky Luc is Zino's greeting when meeting him alone. Training onset open; age-ten build stays childlike.</w:t>
       </w:r>
     </w:p>
     <w:p>
@@ -623,7 +623,7 @@
         <w:rPr>
           <w:b w:val="0"/>
         </w:rPr>
-        <w:t xml:space="preserve"> Five years of Fiango day school end with ten GCE Ordinary-Level subjects (maximum 11) and radio results. Zino's uncle promises school choice and America if Zino succeeds in all five Advanced-Level subjects; Zino chooses a remote boarding school.</w:t>
+        <w:t xml:space="preserve"> Form Five: own songwriting begins; Gideon has a market bread place. Ten O-Level subjects (maximum 11; author-supplied minimum pass 4). Uncle promises school choice and America for all five A-Levels; Zino chooses boarding.</w:t>
       </w:r>
     </w:p>
     <w:p>
@@ -643,7 +643,7 @@
         <w:rPr>
           <w:b w:val="0"/>
         </w:rPr>
-        <w:t xml:space="preserve"> Boarding high school ends with five GCE Advanced-Level subjects (maximum 5), forming Zino's university study area. His school has a 100% Advanced-Level pass rate. When Zino recalls the America promise, his uncle defers it until Zino completes a first university degree.</w:t>
+        <w:t xml:space="preserve"> Five A-Level subjects (maximum 5; author-supplied minimum pass 2); school pass rate 100%. Uncle defers America until a first degree. Zino's first demo follows his boarding-school homecoming; exact recording date open.</w:t>
       </w:r>
     </w:p>
     <w:p>
@@ -797,13 +797,33 @@
         <w:rPr>
           <w:b/>
         </w:rPr>
-        <w:t>Dates to place:</w:t>
-      </w:r>
-      <w:r>
-        <w:rPr>
-          <w:b w:val="0"/>
-        </w:rPr>
-        <w:t xml:space="preserve"> Aunt's killing, loss of housing and farming income, relocation to Douala, and individual jungle-justice incidents within the five day-school years.</w:t>
+        <w:t>School-era dates open:</w:t>
+      </w:r>
+      <w:r>
+        <w:rPr>
+          <w:b w:val="0"/>
+        </w:rPr>
+        <w:t xml:space="preserve"> Individual jungle-justice witness incidents belong within the five Fiango day-school years; exact dates and sequences open.</w:t>
+      </w:r>
+    </w:p>
+    <w:p>
+      <w:r>
+        <w:rPr>
+          <w:b w:val="0"/>
+        </w:rPr>
+        <w:t xml:space="preserve">- </w:t>
+      </w:r>
+      <w:r>
+        <w:rPr>
+          <w:b/>
+        </w:rPr>
+        <w:t>Later crisis dates open:</w:t>
+      </w:r>
+      <w:r>
+        <w:rPr>
+          <w:b w:val="0"/>
+        </w:rPr>
+        <w:t xml:space="preserve"> Aunt's killing, housing/farming losses and Douala relocation belong to the later Ambazonian-crisis history. Exact dates open; do not place these in 2000-2005.</w:t>
       </w:r>
     </w:p>
     <w:p>
@@ -3105,7 +3125,7 @@
       <w:pStyle w:val="Caption"/>
     </w:pPr>
     <w:r>
-      <w:t>Based on Zino's account | Proposed structure for expansion | 28 October 2026</w:t>
+      <w:t>Based on Zino's account | Proposed structure for expansion | 30 October 2026</w:t>
     </w:r>
   </w:p>
 </w:ftr>

</xml_diff>

<commit_message>
Add five character turnarounds and correct night-school casual wardrobe
</commit_message>
<xml_diff>
--- a/series-development/editable/Grand-Chukuchuku_Editable_Outline.docx
+++ b/series-development/editable/Grand-Chukuchuku_Editable_Outline.docx
@@ -222,7 +222,7 @@
         <w:rPr>
           <w:b w:val="0"/>
         </w:rPr>
-        <w:t xml:space="preserve"> Born 1990; witty, kind, just, with temper and people-pleasing flaws. Maths feels like a puzzle; science comes readily. Catholic, primary-school altar server; secondary demands end service. Sings, writes songs from Form Five; first demo after boarding high school, later writing in America. Wants a house for Mother.</w:t>
+        <w:t xml:space="preserve"> Born 1990; handsome, clean fade, witty, kind and just; temper and people-pleasing flaws. Maths feels like a puzzle. Catholic, primary altar server; secondary demands end service. Sings; writes songs from Form Five, first demo after boarding, later music in America. Wants a house for Mother.</w:t>
       </w:r>
     </w:p>
     <w:p>
@@ -298,7 +298,7 @@
         <w:rPr>
           <w:b w:val="0"/>
         </w:rPr>
-        <w:t xml:space="preserve"> W-shaped hairline, fuller almost-afro. Camera gigs, trades and paid services; a market bread place by Form Five. Often pays; asks Zino for schoolwork help. Quiet with girls; loves Sophy in Forms Two-Five. Watches and banters beside football; does not play.</w:t>
+        <w:t xml:space="preserve"> Big head/nose, small front-tooth gap, W hairline and fuller hair. Camera gigs, trades and paid services; market bread place by Form Five. Often pays; asks Zino for schoolwork help. Quiet with girls; loves Sophy in Forms Two-Five. Watches/banters beside football, never plays.</w:t>
       </w:r>
     </w:p>
     <w:p>
@@ -317,7 +317,7 @@
         <w:rPr>
           <w:b w:val="0"/>
         </w:rPr>
-        <w:t xml:space="preserve"> God-fearing, small Bible, school preaching; no football. Muscular from evening mud-formed dumbbells and sandbag training; high flat-top. Zino's maths help and humour matter. Lucky Luc is Zino's greeting when meeting him alone. Training onset open; age-ten build stays childlike.</w:t>
+        <w:t xml:space="preserve"> God-fearing, small Bible, school preaching; no football. Muscular, big hands/ears, high flat-top; evening mud-formed dumbbells and sandbag. Values Zino's maths help and humour. Lucky Luc is Zino's solo greeting. Training onset open; age-ten build stays childlike.</w:t>
       </w:r>
     </w:p>
     <w:p>
@@ -458,7 +458,7 @@
         <w:rPr>
           <w:b w:val="0"/>
         </w:rPr>
-        <w:t xml:space="preserve"> A working vocational campus for building, construction and electrical training. Around June, classrooms open at night for secondary-school exam revision. Genuine individual/group study coexists with socialising, distractions and a pretext to leave home; not every student misbehaves.</w:t>
+        <w:t xml:space="preserve"> Vocational campus by day, open for exam revision at night around June. All night readers wear house/casual clothes; some dress to impress. No uniforms at night. Genuine individual/group study coexists with socialising and distractions; not every student misbehaves.</w:t>
       </w:r>
     </w:p>
     <w:p>
@@ -515,7 +515,7 @@
         <w:rPr>
           <w:b w:val="0"/>
         </w:rPr>
-        <w:t xml:space="preserve"> Ayuk, Arey, Noge, Bismark and Robi play football; Luc/Gideon do not. Children first watch TV through an adjacent barred window, later at Ayuk's during secondary school. The tarred pickup road is five houses behind, near five-storey Azi Motel and Mother's aunt's poultry farm. Uniform: sky-blue short sleeves, dark-blue trousers/skirts.</w:t>
+        <w:t xml:space="preserve"> Ayuk, Arey, Noge, Bismark and Robi play football; Luc/Gideon do not. TV first through an adjacent barred window, later at Ayuk's. Tarred pickup road five houses behind, near five-storey Azi Motel and Mother's aunt's poultry farm. Daytime uniform: sky-blue shirts, dark-blue trousers/skirts.</w:t>
       </w:r>
     </w:p>
     <w:p>

</xml_diff>

<commit_message>
Add GBHS Kumba campus views and uniform badge continuity
</commit_message>
<xml_diff>
--- a/series-development/editable/Grand-Chukuchuku_Editable_Outline.docx
+++ b/series-development/editable/Grand-Chukuchuku_Editable_Outline.docx
@@ -31,7 +31,7 @@
         <w:rPr>
           <w:b w:val="0"/>
         </w:rPr>
-        <w:t>Development draft: 30 October 2026</w:t>
+        <w:t>Development draft: 31 October 2026</w:t>
       </w:r>
     </w:p>
     <w:p>
@@ -515,7 +515,7 @@
         <w:rPr>
           <w:b w:val="0"/>
         </w:rPr>
-        <w:t xml:space="preserve"> Ayuk, Arey, Noge, Bismark and Robi play football; Luc/Gideon do not. TV first through an adjacent barred window, later at Ayuk's. Tarred pickup road five houses behind, near five-storey Azi Motel and Mother's aunt's poultry farm. Daytime uniform: sky-blue shirts, dark-blue trousers/skirts.</w:t>
+        <w:t xml:space="preserve"> Ayuk, Arey, Noge, Bismark and Robi play football; Luc/Gideon do not. TV: barred window, later Ayuk's. Pickup road five houses behind, near five-storey Azi Motel and great-aunt's poultry farm. Day school: GBHS Kumba, reported 10.7 km (route/time open). Sky-blue/navy uniform; left-chest GBHS/candle badge.</w:t>
       </w:r>
     </w:p>
     <w:p>
@@ -1200,7 +1200,7 @@
         <w:rPr>
           <w:b w:val="0"/>
         </w:rPr>
-        <w:t>1. Which day school did you attend with Luc and Gideon, what were your ten Ordinary-Level subjects, and what is one defining memory of Luc, Gideon, Elianne, or Miss Mukete?</w:t>
+        <w:t>1. What were your ten Ordinary-Level subjects at GBHS Kumba, and what is one defining school-day memory of Luc, Gideon, Elianne or Miss Mukete?</w:t>
       </w:r>
     </w:p>
     <w:p>

</xml_diff>